<commit_message>
Refresh Bible resource data for 2026-09-18 release
</commit_message>
<xml_diff>
--- a/arb/docx/008.content.docx
+++ b/arb/docx/008.content.docx
@@ -480,107 +480,83 @@
           <w:lang w:val="ar_AE" w:bidi="ar_AE"/>
         </w:rPr>
       </w:r>
-      <w:hyperlink r:id="rId13">
-        <w:r>
-          <w:rPr>
-            <w:rtl/>
-            <w:cs/>
-            <w:lang w:val="ar_AE" w:bidi="ar_AE"/>
-          </w:rPr>
-          <w:rPr>
-            <w:color w:val="0000EE"/>
-            <w:u w:val="single"/>
-          </w:rPr>
-          <w:t>إرميا 29:3</w:t>
-        </w:r>
-      </w:hyperlink>
-    </w:p>
-    <w:p>
-      <w:pPr>
-        <w:pStyle w:val="ListBullet"/>
-        <w:bidi/>
-        <w:spacing w:line="240" w:lineRule="auto"/>
-        <w:ind w:left="720"/>
-      </w:pPr>
-      <w:r>
-        <w:rPr>
-          <w:rtl/>
-          <w:cs/>
-          <w:lang w:val="ar_AE" w:bidi="ar_AE"/>
-        </w:rPr>
-      </w:r>
-      <w:hyperlink r:id="rId14">
-        <w:r>
-          <w:rPr>
-            <w:rtl/>
-            <w:cs/>
-            <w:lang w:val="ar_AE" w:bidi="ar_AE"/>
-          </w:rPr>
-          <w:rPr>
-            <w:color w:val="0000EE"/>
-            <w:u w:val="single"/>
-          </w:rPr>
-          <w:t>لوقا 4:17</w:t>
-        </w:r>
-      </w:hyperlink>
-    </w:p>
-    <w:p>
-      <w:pPr>
-        <w:pStyle w:val="ListBullet"/>
-        <w:bidi/>
-        <w:spacing w:line="240" w:lineRule="auto"/>
-        <w:ind w:left="720"/>
-      </w:pPr>
-      <w:r>
-        <w:rPr>
-          <w:rtl/>
-          <w:cs/>
-          <w:lang w:val="ar_AE" w:bidi="ar_AE"/>
-        </w:rPr>
-      </w:r>
-      <w:hyperlink r:id="rId15">
-        <w:r>
-          <w:rPr>
-            <w:rtl/>
-            <w:cs/>
-            <w:lang w:val="ar_AE" w:bidi="ar_AE"/>
-          </w:rPr>
-          <w:rPr>
-            <w:color w:val="0000EE"/>
-            <w:u w:val="single"/>
-          </w:rPr>
-          <w:t>العدد 21:14–15</w:t>
-        </w:r>
-      </w:hyperlink>
-    </w:p>
-    <w:p>
-      <w:pPr>
-        <w:pStyle w:val="ListBullet"/>
-        <w:bidi/>
-        <w:spacing w:line="240" w:lineRule="auto"/>
-        <w:ind w:left="720"/>
-      </w:pPr>
-      <w:r>
-        <w:rPr>
-          <w:rtl/>
-          <w:cs/>
-          <w:lang w:val="ar_AE" w:bidi="ar_AE"/>
-        </w:rPr>
-      </w:r>
-      <w:hyperlink r:id="rId16">
-        <w:r>
-          <w:rPr>
-            <w:rtl/>
-            <w:cs/>
-            <w:lang w:val="ar_AE" w:bidi="ar_AE"/>
-          </w:rPr>
-          <w:rPr>
-            <w:color w:val="0000EE"/>
-            <w:u w:val="single"/>
-          </w:rPr>
-          <w:t>رؤيا 5:2</w:t>
-        </w:r>
-      </w:hyperlink>
+      <w:r>
+        <w:rPr>
+          <w:rtl/>
+          <w:cs/>
+          <w:lang w:val="ar_AE" w:bidi="ar_AE"/>
+        </w:rPr>
+        <w:t>إرميا 29:3</w:t>
+      </w:r>
+    </w:p>
+    <w:p>
+      <w:pPr>
+        <w:pStyle w:val="ListBullet"/>
+        <w:bidi/>
+        <w:spacing w:line="240" w:lineRule="auto"/>
+        <w:ind w:left="720"/>
+      </w:pPr>
+      <w:r>
+        <w:rPr>
+          <w:rtl/>
+          <w:cs/>
+          <w:lang w:val="ar_AE" w:bidi="ar_AE"/>
+        </w:rPr>
+      </w:r>
+      <w:r>
+        <w:rPr>
+          <w:rtl/>
+          <w:cs/>
+          <w:lang w:val="ar_AE" w:bidi="ar_AE"/>
+        </w:rPr>
+        <w:t>لوقا 4:17</w:t>
+      </w:r>
+    </w:p>
+    <w:p>
+      <w:pPr>
+        <w:pStyle w:val="ListBullet"/>
+        <w:bidi/>
+        <w:spacing w:line="240" w:lineRule="auto"/>
+        <w:ind w:left="720"/>
+      </w:pPr>
+      <w:r>
+        <w:rPr>
+          <w:rtl/>
+          <w:cs/>
+          <w:lang w:val="ar_AE" w:bidi="ar_AE"/>
+        </w:rPr>
+      </w:r>
+      <w:r>
+        <w:rPr>
+          <w:rtl/>
+          <w:cs/>
+          <w:lang w:val="ar_AE" w:bidi="ar_AE"/>
+        </w:rPr>
+        <w:t>العدد 21:14–15</w:t>
+      </w:r>
+    </w:p>
+    <w:p>
+      <w:pPr>
+        <w:pStyle w:val="ListBullet"/>
+        <w:bidi/>
+        <w:spacing w:line="240" w:lineRule="auto"/>
+        <w:ind w:left="720"/>
+      </w:pPr>
+      <w:r>
+        <w:rPr>
+          <w:rtl/>
+          <w:cs/>
+          <w:lang w:val="ar_AE" w:bidi="ar_AE"/>
+        </w:rPr>
+      </w:r>
+      <w:r>
+        <w:rPr>
+          <w:rtl/>
+          <w:cs/>
+          <w:lang w:val="ar_AE" w:bidi="ar_AE"/>
+        </w:rPr>
+        <w:t>رؤيا 5:2</w:t>
+      </w:r>
     </w:p>
     <w:p>
       <w:pPr>
@@ -956,107 +932,83 @@
           <w:lang w:val="ar_AE" w:bidi="ar_AE"/>
         </w:rPr>
       </w:r>
-      <w:hyperlink r:id="rId17">
-        <w:r>
-          <w:rPr>
-            <w:rtl/>
-            <w:cs/>
-            <w:lang w:val="ar_AE" w:bidi="ar_AE"/>
-          </w:rPr>
-          <w:rPr>
-            <w:color w:val="0000EE"/>
-            <w:u w:val="single"/>
-          </w:rPr>
-          <w:t>عزرا 4: 4–6</w:t>
-        </w:r>
-      </w:hyperlink>
-    </w:p>
-    <w:p>
-      <w:pPr>
-        <w:pStyle w:val="ListBullet"/>
-        <w:bidi/>
-        <w:spacing w:line="240" w:lineRule="auto"/>
-        <w:ind w:left="720"/>
-      </w:pPr>
-      <w:r>
-        <w:rPr>
-          <w:rtl/>
-          <w:cs/>
-          <w:lang w:val="ar_AE" w:bidi="ar_AE"/>
-        </w:rPr>
-      </w:r>
-      <w:hyperlink r:id="rId18">
-        <w:r>
-          <w:rPr>
-            <w:rtl/>
-            <w:cs/>
-            <w:lang w:val="ar_AE" w:bidi="ar_AE"/>
-          </w:rPr>
-          <w:rPr>
-            <w:color w:val="0000EE"/>
-            <w:u w:val="single"/>
-          </w:rPr>
-          <w:t>حجي 1: 1</w:t>
-        </w:r>
-      </w:hyperlink>
-    </w:p>
-    <w:p>
-      <w:pPr>
-        <w:pStyle w:val="ListBullet"/>
-        <w:bidi/>
-        <w:spacing w:line="240" w:lineRule="auto"/>
-        <w:ind w:left="720"/>
-      </w:pPr>
-      <w:r>
-        <w:rPr>
-          <w:rtl/>
-          <w:cs/>
-          <w:lang w:val="ar_AE" w:bidi="ar_AE"/>
-        </w:rPr>
-      </w:r>
-      <w:hyperlink r:id="rId19">
-        <w:r>
-          <w:rPr>
-            <w:rtl/>
-            <w:cs/>
-            <w:lang w:val="ar_AE" w:bidi="ar_AE"/>
-          </w:rPr>
-          <w:rPr>
-            <w:color w:val="0000EE"/>
-            <w:u w:val="single"/>
-          </w:rPr>
-          <w:t>نحميا 12: 22</w:t>
-        </w:r>
-      </w:hyperlink>
-    </w:p>
-    <w:p>
-      <w:pPr>
-        <w:pStyle w:val="ListBullet"/>
-        <w:bidi/>
-        <w:spacing w:line="240" w:lineRule="auto"/>
-        <w:ind w:left="720"/>
-      </w:pPr>
-      <w:r>
-        <w:rPr>
-          <w:rtl/>
-          <w:cs/>
-          <w:lang w:val="ar_AE" w:bidi="ar_AE"/>
-        </w:rPr>
-      </w:r>
-      <w:hyperlink r:id="rId20">
-        <w:r>
-          <w:rPr>
-            <w:rtl/>
-            <w:cs/>
-            <w:lang w:val="ar_AE" w:bidi="ar_AE"/>
-          </w:rPr>
-          <w:rPr>
-            <w:color w:val="0000EE"/>
-            <w:u w:val="single"/>
-          </w:rPr>
-          <w:t>زكريا 1: 1</w:t>
-        </w:r>
-      </w:hyperlink>
+      <w:r>
+        <w:rPr>
+          <w:rtl/>
+          <w:cs/>
+          <w:lang w:val="ar_AE" w:bidi="ar_AE"/>
+        </w:rPr>
+        <w:t>عزرا 4: 4–6</w:t>
+      </w:r>
+    </w:p>
+    <w:p>
+      <w:pPr>
+        <w:pStyle w:val="ListBullet"/>
+        <w:bidi/>
+        <w:spacing w:line="240" w:lineRule="auto"/>
+        <w:ind w:left="720"/>
+      </w:pPr>
+      <w:r>
+        <w:rPr>
+          <w:rtl/>
+          <w:cs/>
+          <w:lang w:val="ar_AE" w:bidi="ar_AE"/>
+        </w:rPr>
+      </w:r>
+      <w:r>
+        <w:rPr>
+          <w:rtl/>
+          <w:cs/>
+          <w:lang w:val="ar_AE" w:bidi="ar_AE"/>
+        </w:rPr>
+        <w:t>حجي 1: 1</w:t>
+      </w:r>
+    </w:p>
+    <w:p>
+      <w:pPr>
+        <w:pStyle w:val="ListBullet"/>
+        <w:bidi/>
+        <w:spacing w:line="240" w:lineRule="auto"/>
+        <w:ind w:left="720"/>
+      </w:pPr>
+      <w:r>
+        <w:rPr>
+          <w:rtl/>
+          <w:cs/>
+          <w:lang w:val="ar_AE" w:bidi="ar_AE"/>
+        </w:rPr>
+      </w:r>
+      <w:r>
+        <w:rPr>
+          <w:rtl/>
+          <w:cs/>
+          <w:lang w:val="ar_AE" w:bidi="ar_AE"/>
+        </w:rPr>
+        <w:t>نحميا 12: 22</w:t>
+      </w:r>
+    </w:p>
+    <w:p>
+      <w:pPr>
+        <w:pStyle w:val="ListBullet"/>
+        <w:bidi/>
+        <w:spacing w:line="240" w:lineRule="auto"/>
+        <w:ind w:left="720"/>
+      </w:pPr>
+      <w:r>
+        <w:rPr>
+          <w:rtl/>
+          <w:cs/>
+          <w:lang w:val="ar_AE" w:bidi="ar_AE"/>
+        </w:rPr>
+      </w:r>
+      <w:r>
+        <w:rPr>
+          <w:rtl/>
+          <w:cs/>
+          <w:lang w:val="ar_AE" w:bidi="ar_AE"/>
+        </w:rPr>
+        <w:t>زكريا 1: 1</w:t>
+      </w:r>
     </w:p>
     <w:p>
       <w:pPr>
@@ -1361,136 +1313,106 @@
           <w:lang w:val="ar_AE" w:bidi="ar_AE"/>
         </w:rPr>
       </w:r>
-      <w:hyperlink r:id="rId21">
-        <w:r>
-          <w:rPr>
-            <w:rtl/>
-            <w:cs/>
-            <w:lang w:val="ar_AE" w:bidi="ar_AE"/>
-          </w:rPr>
-          <w:rPr>
-            <w:color w:val="0000EE"/>
-            <w:u w:val="single"/>
-          </w:rPr>
-          <w:t>1 أخبار الأيام 12:35</w:t>
-        </w:r>
-      </w:hyperlink>
-    </w:p>
-    <w:p>
-      <w:pPr>
-        <w:pStyle w:val="ListBullet"/>
-        <w:bidi/>
-        <w:spacing w:line="240" w:lineRule="auto"/>
-        <w:ind w:left="720"/>
-      </w:pPr>
-      <w:r>
-        <w:rPr>
-          <w:rtl/>
-          <w:cs/>
-          <w:lang w:val="ar_AE" w:bidi="ar_AE"/>
-        </w:rPr>
-      </w:r>
-      <w:hyperlink r:id="rId22">
-        <w:r>
-          <w:rPr>
-            <w:rtl/>
-            <w:cs/>
-            <w:lang w:val="ar_AE" w:bidi="ar_AE"/>
-          </w:rPr>
-          <w:rPr>
-            <w:color w:val="0000EE"/>
-            <w:u w:val="single"/>
-          </w:rPr>
-          <w:t>1 ملوك 4:25</w:t>
-        </w:r>
-      </w:hyperlink>
-    </w:p>
-    <w:p>
-      <w:pPr>
-        <w:pStyle w:val="ListBullet"/>
-        <w:bidi/>
-        <w:spacing w:line="240" w:lineRule="auto"/>
-        <w:ind w:left="720"/>
-      </w:pPr>
-      <w:r>
-        <w:rPr>
-          <w:rtl/>
-          <w:cs/>
-          <w:lang w:val="ar_AE" w:bidi="ar_AE"/>
-        </w:rPr>
-      </w:r>
-      <w:hyperlink r:id="rId23">
-        <w:r>
-          <w:rPr>
-            <w:rtl/>
-            <w:cs/>
-            <w:lang w:val="ar_AE" w:bidi="ar_AE"/>
-          </w:rPr>
-          <w:rPr>
-            <w:color w:val="0000EE"/>
-            <w:u w:val="single"/>
-          </w:rPr>
-          <w:t>خروج 1:1–5</w:t>
-        </w:r>
-      </w:hyperlink>
-    </w:p>
-    <w:p>
-      <w:pPr>
-        <w:pStyle w:val="ListBullet"/>
-        <w:bidi/>
-        <w:spacing w:line="240" w:lineRule="auto"/>
-        <w:ind w:left="720"/>
-      </w:pPr>
-      <w:r>
-        <w:rPr>
-          <w:rtl/>
-          <w:cs/>
-          <w:lang w:val="ar_AE" w:bidi="ar_AE"/>
-        </w:rPr>
-      </w:r>
-      <w:hyperlink r:id="rId24">
-        <w:r>
-          <w:rPr>
-            <w:rtl/>
-            <w:cs/>
-            <w:lang w:val="ar_AE" w:bidi="ar_AE"/>
-          </w:rPr>
-          <w:rPr>
-            <w:color w:val="0000EE"/>
-            <w:u w:val="single"/>
-          </w:rPr>
-          <w:t>تكوين 14:14</w:t>
-        </w:r>
-      </w:hyperlink>
-    </w:p>
-    <w:p>
-      <w:pPr>
-        <w:pStyle w:val="ListBullet"/>
-        <w:bidi/>
-        <w:spacing w:line="240" w:lineRule="auto"/>
-        <w:ind w:left="720"/>
-      </w:pPr>
-      <w:r>
-        <w:rPr>
-          <w:rtl/>
-          <w:cs/>
-          <w:lang w:val="ar_AE" w:bidi="ar_AE"/>
-        </w:rPr>
-      </w:r>
-      <w:hyperlink r:id="rId25">
-        <w:r>
-          <w:rPr>
-            <w:rtl/>
-            <w:cs/>
-            <w:lang w:val="ar_AE" w:bidi="ar_AE"/>
-          </w:rPr>
-          <w:rPr>
-            <w:color w:val="0000EE"/>
-            <w:u w:val="single"/>
-          </w:rPr>
-          <w:t>تكوين 30:6</w:t>
-        </w:r>
-      </w:hyperlink>
+      <w:r>
+        <w:rPr>
+          <w:rtl/>
+          <w:cs/>
+          <w:lang w:val="ar_AE" w:bidi="ar_AE"/>
+        </w:rPr>
+        <w:t>1 أخبار الأيام 12:35</w:t>
+      </w:r>
+    </w:p>
+    <w:p>
+      <w:pPr>
+        <w:pStyle w:val="ListBullet"/>
+        <w:bidi/>
+        <w:spacing w:line="240" w:lineRule="auto"/>
+        <w:ind w:left="720"/>
+      </w:pPr>
+      <w:r>
+        <w:rPr>
+          <w:rtl/>
+          <w:cs/>
+          <w:lang w:val="ar_AE" w:bidi="ar_AE"/>
+        </w:rPr>
+      </w:r>
+      <w:r>
+        <w:rPr>
+          <w:rtl/>
+          <w:cs/>
+          <w:lang w:val="ar_AE" w:bidi="ar_AE"/>
+        </w:rPr>
+        <w:t>1 ملوك 4:25</w:t>
+      </w:r>
+    </w:p>
+    <w:p>
+      <w:pPr>
+        <w:pStyle w:val="ListBullet"/>
+        <w:bidi/>
+        <w:spacing w:line="240" w:lineRule="auto"/>
+        <w:ind w:left="720"/>
+      </w:pPr>
+      <w:r>
+        <w:rPr>
+          <w:rtl/>
+          <w:cs/>
+          <w:lang w:val="ar_AE" w:bidi="ar_AE"/>
+        </w:rPr>
+      </w:r>
+      <w:r>
+        <w:rPr>
+          <w:rtl/>
+          <w:cs/>
+          <w:lang w:val="ar_AE" w:bidi="ar_AE"/>
+        </w:rPr>
+        <w:t>خروج 1:1–5</w:t>
+      </w:r>
+    </w:p>
+    <w:p>
+      <w:pPr>
+        <w:pStyle w:val="ListBullet"/>
+        <w:bidi/>
+        <w:spacing w:line="240" w:lineRule="auto"/>
+        <w:ind w:left="720"/>
+      </w:pPr>
+      <w:r>
+        <w:rPr>
+          <w:rtl/>
+          <w:cs/>
+          <w:lang w:val="ar_AE" w:bidi="ar_AE"/>
+        </w:rPr>
+      </w:r>
+      <w:r>
+        <w:rPr>
+          <w:rtl/>
+          <w:cs/>
+          <w:lang w:val="ar_AE" w:bidi="ar_AE"/>
+        </w:rPr>
+        <w:t>تكوين 14:14</w:t>
+      </w:r>
+    </w:p>
+    <w:p>
+      <w:pPr>
+        <w:pStyle w:val="ListBullet"/>
+        <w:bidi/>
+        <w:spacing w:line="240" w:lineRule="auto"/>
+        <w:ind w:left="720"/>
+      </w:pPr>
+      <w:r>
+        <w:rPr>
+          <w:rtl/>
+          <w:cs/>
+          <w:lang w:val="ar_AE" w:bidi="ar_AE"/>
+        </w:rPr>
+      </w:r>
+      <w:r>
+        <w:rPr>
+          <w:rtl/>
+          <w:cs/>
+          <w:lang w:val="ar_AE" w:bidi="ar_AE"/>
+        </w:rPr>
+        <w:t>تكوين 30:6</w:t>
+      </w:r>
     </w:p>
     <w:p>
       <w:pPr>
@@ -1848,136 +1770,106 @@
           <w:lang w:val="ar_AE" w:bidi="ar_AE"/>
         </w:rPr>
       </w:r>
-      <w:hyperlink r:id="rId26">
-        <w:r>
-          <w:rPr>
-            <w:rtl/>
-            <w:cs/>
-            <w:lang w:val="ar_AE" w:bidi="ar_AE"/>
-          </w:rPr>
-          <w:rPr>
-            <w:color w:val="0000EE"/>
-            <w:u w:val="single"/>
-          </w:rPr>
-          <w:t>دانيال 1:6–7</w:t>
-        </w:r>
-      </w:hyperlink>
-    </w:p>
-    <w:p>
-      <w:pPr>
-        <w:pStyle w:val="ListBullet"/>
-        <w:bidi/>
-        <w:spacing w:line="240" w:lineRule="auto"/>
-        <w:ind w:left="720"/>
-      </w:pPr>
-      <w:r>
-        <w:rPr>
-          <w:rtl/>
-          <w:cs/>
-          <w:lang w:val="ar_AE" w:bidi="ar_AE"/>
-        </w:rPr>
-      </w:r>
-      <w:hyperlink r:id="rId27">
-        <w:r>
-          <w:rPr>
-            <w:rtl/>
-            <w:cs/>
-            <w:lang w:val="ar_AE" w:bidi="ar_AE"/>
-          </w:rPr>
-          <w:rPr>
-            <w:color w:val="0000EE"/>
-            <w:u w:val="single"/>
-          </w:rPr>
-          <w:t>دانيال 5:29</w:t>
-        </w:r>
-      </w:hyperlink>
-    </w:p>
-    <w:p>
-      <w:pPr>
-        <w:pStyle w:val="ListBullet"/>
-        <w:bidi/>
-        <w:spacing w:line="240" w:lineRule="auto"/>
-        <w:ind w:left="720"/>
-      </w:pPr>
-      <w:r>
-        <w:rPr>
-          <w:rtl/>
-          <w:cs/>
-          <w:lang w:val="ar_AE" w:bidi="ar_AE"/>
-        </w:rPr>
-      </w:r>
-      <w:hyperlink r:id="rId28">
-        <w:r>
-          <w:rPr>
-            <w:rtl/>
-            <w:cs/>
-            <w:lang w:val="ar_AE" w:bidi="ar_AE"/>
-          </w:rPr>
-          <w:rPr>
-            <w:color w:val="0000EE"/>
-            <w:u w:val="single"/>
-          </w:rPr>
-          <w:t>دانيال 7:28</w:t>
-        </w:r>
-      </w:hyperlink>
-    </w:p>
-    <w:p>
-      <w:pPr>
-        <w:pStyle w:val="ListBullet"/>
-        <w:bidi/>
-        <w:spacing w:line="240" w:lineRule="auto"/>
-        <w:ind w:left="720"/>
-      </w:pPr>
-      <w:r>
-        <w:rPr>
-          <w:rtl/>
-          <w:cs/>
-          <w:lang w:val="ar_AE" w:bidi="ar_AE"/>
-        </w:rPr>
-      </w:r>
-      <w:hyperlink r:id="rId29">
-        <w:r>
-          <w:rPr>
-            <w:rtl/>
-            <w:cs/>
-            <w:lang w:val="ar_AE" w:bidi="ar_AE"/>
-          </w:rPr>
-          <w:rPr>
-            <w:color w:val="0000EE"/>
-            <w:u w:val="single"/>
-          </w:rPr>
-          <w:t>حزقيال 14:12–14</w:t>
-        </w:r>
-      </w:hyperlink>
-    </w:p>
-    <w:p>
-      <w:pPr>
-        <w:pStyle w:val="ListBullet"/>
-        <w:bidi/>
-        <w:spacing w:line="240" w:lineRule="auto"/>
-        <w:ind w:left="720"/>
-      </w:pPr>
-      <w:r>
-        <w:rPr>
-          <w:rtl/>
-          <w:cs/>
-          <w:lang w:val="ar_AE" w:bidi="ar_AE"/>
-        </w:rPr>
-      </w:r>
-      <w:hyperlink r:id="rId30">
-        <w:r>
-          <w:rPr>
-            <w:rtl/>
-            <w:cs/>
-            <w:lang w:val="ar_AE" w:bidi="ar_AE"/>
-          </w:rPr>
-          <w:rPr>
-            <w:color w:val="0000EE"/>
-            <w:u w:val="single"/>
-          </w:rPr>
-          <w:t>متى 24:15</w:t>
-        </w:r>
-      </w:hyperlink>
+      <w:r>
+        <w:rPr>
+          <w:rtl/>
+          <w:cs/>
+          <w:lang w:val="ar_AE" w:bidi="ar_AE"/>
+        </w:rPr>
+        <w:t>دانيال 1:6–7</w:t>
+      </w:r>
+    </w:p>
+    <w:p>
+      <w:pPr>
+        <w:pStyle w:val="ListBullet"/>
+        <w:bidi/>
+        <w:spacing w:line="240" w:lineRule="auto"/>
+        <w:ind w:left="720"/>
+      </w:pPr>
+      <w:r>
+        <w:rPr>
+          <w:rtl/>
+          <w:cs/>
+          <w:lang w:val="ar_AE" w:bidi="ar_AE"/>
+        </w:rPr>
+      </w:r>
+      <w:r>
+        <w:rPr>
+          <w:rtl/>
+          <w:cs/>
+          <w:lang w:val="ar_AE" w:bidi="ar_AE"/>
+        </w:rPr>
+        <w:t>دانيال 5:29</w:t>
+      </w:r>
+    </w:p>
+    <w:p>
+      <w:pPr>
+        <w:pStyle w:val="ListBullet"/>
+        <w:bidi/>
+        <w:spacing w:line="240" w:lineRule="auto"/>
+        <w:ind w:left="720"/>
+      </w:pPr>
+      <w:r>
+        <w:rPr>
+          <w:rtl/>
+          <w:cs/>
+          <w:lang w:val="ar_AE" w:bidi="ar_AE"/>
+        </w:rPr>
+      </w:r>
+      <w:r>
+        <w:rPr>
+          <w:rtl/>
+          <w:cs/>
+          <w:lang w:val="ar_AE" w:bidi="ar_AE"/>
+        </w:rPr>
+        <w:t>دانيال 7:28</w:t>
+      </w:r>
+    </w:p>
+    <w:p>
+      <w:pPr>
+        <w:pStyle w:val="ListBullet"/>
+        <w:bidi/>
+        <w:spacing w:line="240" w:lineRule="auto"/>
+        <w:ind w:left="720"/>
+      </w:pPr>
+      <w:r>
+        <w:rPr>
+          <w:rtl/>
+          <w:cs/>
+          <w:lang w:val="ar_AE" w:bidi="ar_AE"/>
+        </w:rPr>
+      </w:r>
+      <w:r>
+        <w:rPr>
+          <w:rtl/>
+          <w:cs/>
+          <w:lang w:val="ar_AE" w:bidi="ar_AE"/>
+        </w:rPr>
+        <w:t>حزقيال 14:12–14</w:t>
+      </w:r>
+    </w:p>
+    <w:p>
+      <w:pPr>
+        <w:pStyle w:val="ListBullet"/>
+        <w:bidi/>
+        <w:spacing w:line="240" w:lineRule="auto"/>
+        <w:ind w:left="720"/>
+      </w:pPr>
+      <w:r>
+        <w:rPr>
+          <w:rtl/>
+          <w:cs/>
+          <w:lang w:val="ar_AE" w:bidi="ar_AE"/>
+        </w:rPr>
+      </w:r>
+      <w:r>
+        <w:rPr>
+          <w:rtl/>
+          <w:cs/>
+          <w:lang w:val="ar_AE" w:bidi="ar_AE"/>
+        </w:rPr>
+        <w:t>متى 24:15</w:t>
+      </w:r>
     </w:p>
     <w:p>
       <w:pPr>
@@ -2328,223 +2220,175 @@
           <w:lang w:val="ar_AE" w:bidi="ar_AE"/>
         </w:rPr>
       </w:r>
-      <w:hyperlink r:id="rId31">
-        <w:r>
-          <w:rPr>
-            <w:rtl/>
-            <w:cs/>
-            <w:lang w:val="ar_AE" w:bidi="ar_AE"/>
-          </w:rPr>
-          <w:rPr>
-            <w:color w:val="0000EE"/>
-            <w:u w:val="single"/>
-          </w:rPr>
-          <w:t>صموئيل الأول17 :12–13</w:t>
-        </w:r>
-      </w:hyperlink>
-    </w:p>
-    <w:p>
-      <w:pPr>
-        <w:pStyle w:val="ListBullet"/>
-        <w:bidi/>
-        <w:spacing w:line="240" w:lineRule="auto"/>
-        <w:ind w:left="720"/>
-      </w:pPr>
-      <w:r>
-        <w:rPr>
-          <w:rtl/>
-          <w:cs/>
-          <w:lang w:val="ar_AE" w:bidi="ar_AE"/>
-        </w:rPr>
-      </w:r>
-      <w:hyperlink r:id="rId32">
-        <w:r>
-          <w:rPr>
-            <w:rtl/>
-            <w:cs/>
-            <w:lang w:val="ar_AE" w:bidi="ar_AE"/>
-          </w:rPr>
-          <w:rPr>
-            <w:color w:val="0000EE"/>
-            <w:u w:val="single"/>
-          </w:rPr>
-          <w:t>صموئيل الأول20 :34</w:t>
-        </w:r>
-      </w:hyperlink>
-    </w:p>
-    <w:p>
-      <w:pPr>
-        <w:pStyle w:val="ListBullet"/>
-        <w:bidi/>
-        <w:spacing w:line="240" w:lineRule="auto"/>
-        <w:ind w:left="720"/>
-      </w:pPr>
-      <w:r>
-        <w:rPr>
-          <w:rtl/>
-          <w:cs/>
-          <w:lang w:val="ar_AE" w:bidi="ar_AE"/>
-        </w:rPr>
-      </w:r>
-      <w:hyperlink r:id="rId33">
-        <w:r>
-          <w:rPr>
-            <w:rtl/>
-            <w:cs/>
-            <w:lang w:val="ar_AE" w:bidi="ar_AE"/>
-          </w:rPr>
-          <w:rPr>
-            <w:color w:val="0000EE"/>
-            <w:u w:val="single"/>
-          </w:rPr>
-          <w:t>صموئيل الثاني5 :2</w:t>
-        </w:r>
-      </w:hyperlink>
-    </w:p>
-    <w:p>
-      <w:pPr>
-        <w:pStyle w:val="ListBullet"/>
-        <w:bidi/>
-        <w:spacing w:line="240" w:lineRule="auto"/>
-        <w:ind w:left="720"/>
-      </w:pPr>
-      <w:r>
-        <w:rPr>
-          <w:rtl/>
-          <w:cs/>
-          <w:lang w:val="ar_AE" w:bidi="ar_AE"/>
-        </w:rPr>
-      </w:r>
-      <w:hyperlink r:id="rId34">
-        <w:r>
-          <w:rPr>
-            <w:rtl/>
-            <w:cs/>
-            <w:lang w:val="ar_AE" w:bidi="ar_AE"/>
-          </w:rPr>
-          <w:rPr>
-            <w:color w:val="0000EE"/>
-            <w:u w:val="single"/>
-          </w:rPr>
-          <w:t>تيموثاوس الثانية2 :8</w:t>
-        </w:r>
-      </w:hyperlink>
-    </w:p>
-    <w:p>
-      <w:pPr>
-        <w:pStyle w:val="ListBullet"/>
-        <w:bidi/>
-        <w:spacing w:line="240" w:lineRule="auto"/>
-        <w:ind w:left="720"/>
-      </w:pPr>
-      <w:r>
-        <w:rPr>
-          <w:rtl/>
-          <w:cs/>
-          <w:lang w:val="ar_AE" w:bidi="ar_AE"/>
-        </w:rPr>
-      </w:r>
-      <w:hyperlink r:id="rId35">
-        <w:r>
-          <w:rPr>
-            <w:rtl/>
-            <w:cs/>
-            <w:lang w:val="ar_AE" w:bidi="ar_AE"/>
-          </w:rPr>
-          <w:rPr>
-            <w:color w:val="0000EE"/>
-            <w:u w:val="single"/>
-          </w:rPr>
-          <w:t>أعمال الرسل2 :25</w:t>
-        </w:r>
-      </w:hyperlink>
-    </w:p>
-    <w:p>
-      <w:pPr>
-        <w:pStyle w:val="ListBullet"/>
-        <w:bidi/>
-        <w:spacing w:line="240" w:lineRule="auto"/>
-        <w:ind w:left="720"/>
-      </w:pPr>
-      <w:r>
-        <w:rPr>
-          <w:rtl/>
-          <w:cs/>
-          <w:lang w:val="ar_AE" w:bidi="ar_AE"/>
-        </w:rPr>
-      </w:r>
-      <w:hyperlink r:id="rId36">
-        <w:r>
-          <w:rPr>
-            <w:rtl/>
-            <w:cs/>
-            <w:lang w:val="ar_AE" w:bidi="ar_AE"/>
-          </w:rPr>
-          <w:rPr>
-            <w:color w:val="0000EE"/>
-            <w:u w:val="single"/>
-          </w:rPr>
-          <w:t>أعمال الرسل13 :22</w:t>
-        </w:r>
-      </w:hyperlink>
-    </w:p>
-    <w:p>
-      <w:pPr>
-        <w:pStyle w:val="ListBullet"/>
-        <w:bidi/>
-        <w:spacing w:line="240" w:lineRule="auto"/>
-        <w:ind w:left="720"/>
-      </w:pPr>
-      <w:r>
-        <w:rPr>
-          <w:rtl/>
-          <w:cs/>
-          <w:lang w:val="ar_AE" w:bidi="ar_AE"/>
-        </w:rPr>
-      </w:r>
-      <w:hyperlink r:id="rId37">
-        <w:r>
-          <w:rPr>
-            <w:rtl/>
-            <w:cs/>
-            <w:lang w:val="ar_AE" w:bidi="ar_AE"/>
-          </w:rPr>
-          <w:rPr>
-            <w:color w:val="0000EE"/>
-            <w:u w:val="single"/>
-          </w:rPr>
-          <w:t>لوقا1 :32</w:t>
-        </w:r>
-      </w:hyperlink>
-    </w:p>
-    <w:p>
-      <w:pPr>
-        <w:pStyle w:val="ListBullet"/>
-        <w:bidi/>
-        <w:spacing w:line="240" w:lineRule="auto"/>
-        <w:ind w:left="720"/>
-      </w:pPr>
-      <w:r>
-        <w:rPr>
-          <w:rtl/>
-          <w:cs/>
-          <w:lang w:val="ar_AE" w:bidi="ar_AE"/>
-        </w:rPr>
-      </w:r>
-      <w:hyperlink r:id="rId38">
-        <w:r>
-          <w:rPr>
-            <w:rtl/>
-            <w:cs/>
-            <w:lang w:val="ar_AE" w:bidi="ar_AE"/>
-          </w:rPr>
-          <w:rPr>
-            <w:color w:val="0000EE"/>
-            <w:u w:val="single"/>
-          </w:rPr>
-          <w:t>مرقس2 :26</w:t>
-        </w:r>
-      </w:hyperlink>
+      <w:r>
+        <w:rPr>
+          <w:rtl/>
+          <w:cs/>
+          <w:lang w:val="ar_AE" w:bidi="ar_AE"/>
+        </w:rPr>
+        <w:t>صموئيل الأول17 :12–13</w:t>
+      </w:r>
+    </w:p>
+    <w:p>
+      <w:pPr>
+        <w:pStyle w:val="ListBullet"/>
+        <w:bidi/>
+        <w:spacing w:line="240" w:lineRule="auto"/>
+        <w:ind w:left="720"/>
+      </w:pPr>
+      <w:r>
+        <w:rPr>
+          <w:rtl/>
+          <w:cs/>
+          <w:lang w:val="ar_AE" w:bidi="ar_AE"/>
+        </w:rPr>
+      </w:r>
+      <w:r>
+        <w:rPr>
+          <w:rtl/>
+          <w:cs/>
+          <w:lang w:val="ar_AE" w:bidi="ar_AE"/>
+        </w:rPr>
+        <w:t>صموئيل الأول20 :34</w:t>
+      </w:r>
+    </w:p>
+    <w:p>
+      <w:pPr>
+        <w:pStyle w:val="ListBullet"/>
+        <w:bidi/>
+        <w:spacing w:line="240" w:lineRule="auto"/>
+        <w:ind w:left="720"/>
+      </w:pPr>
+      <w:r>
+        <w:rPr>
+          <w:rtl/>
+          <w:cs/>
+          <w:lang w:val="ar_AE" w:bidi="ar_AE"/>
+        </w:rPr>
+      </w:r>
+      <w:r>
+        <w:rPr>
+          <w:rtl/>
+          <w:cs/>
+          <w:lang w:val="ar_AE" w:bidi="ar_AE"/>
+        </w:rPr>
+        <w:t>صموئيل الثاني5 :2</w:t>
+      </w:r>
+    </w:p>
+    <w:p>
+      <w:pPr>
+        <w:pStyle w:val="ListBullet"/>
+        <w:bidi/>
+        <w:spacing w:line="240" w:lineRule="auto"/>
+        <w:ind w:left="720"/>
+      </w:pPr>
+      <w:r>
+        <w:rPr>
+          <w:rtl/>
+          <w:cs/>
+          <w:lang w:val="ar_AE" w:bidi="ar_AE"/>
+        </w:rPr>
+      </w:r>
+      <w:r>
+        <w:rPr>
+          <w:rtl/>
+          <w:cs/>
+          <w:lang w:val="ar_AE" w:bidi="ar_AE"/>
+        </w:rPr>
+        <w:t>تيموثاوس الثانية2 :8</w:t>
+      </w:r>
+    </w:p>
+    <w:p>
+      <w:pPr>
+        <w:pStyle w:val="ListBullet"/>
+        <w:bidi/>
+        <w:spacing w:line="240" w:lineRule="auto"/>
+        <w:ind w:left="720"/>
+      </w:pPr>
+      <w:r>
+        <w:rPr>
+          <w:rtl/>
+          <w:cs/>
+          <w:lang w:val="ar_AE" w:bidi="ar_AE"/>
+        </w:rPr>
+      </w:r>
+      <w:r>
+        <w:rPr>
+          <w:rtl/>
+          <w:cs/>
+          <w:lang w:val="ar_AE" w:bidi="ar_AE"/>
+        </w:rPr>
+        <w:t>أعمال الرسل2 :25</w:t>
+      </w:r>
+    </w:p>
+    <w:p>
+      <w:pPr>
+        <w:pStyle w:val="ListBullet"/>
+        <w:bidi/>
+        <w:spacing w:line="240" w:lineRule="auto"/>
+        <w:ind w:left="720"/>
+      </w:pPr>
+      <w:r>
+        <w:rPr>
+          <w:rtl/>
+          <w:cs/>
+          <w:lang w:val="ar_AE" w:bidi="ar_AE"/>
+        </w:rPr>
+      </w:r>
+      <w:r>
+        <w:rPr>
+          <w:rtl/>
+          <w:cs/>
+          <w:lang w:val="ar_AE" w:bidi="ar_AE"/>
+        </w:rPr>
+        <w:t>أعمال الرسل13 :22</w:t>
+      </w:r>
+    </w:p>
+    <w:p>
+      <w:pPr>
+        <w:pStyle w:val="ListBullet"/>
+        <w:bidi/>
+        <w:spacing w:line="240" w:lineRule="auto"/>
+        <w:ind w:left="720"/>
+      </w:pPr>
+      <w:r>
+        <w:rPr>
+          <w:rtl/>
+          <w:cs/>
+          <w:lang w:val="ar_AE" w:bidi="ar_AE"/>
+        </w:rPr>
+      </w:r>
+      <w:r>
+        <w:rPr>
+          <w:rtl/>
+          <w:cs/>
+          <w:lang w:val="ar_AE" w:bidi="ar_AE"/>
+        </w:rPr>
+        <w:t>لوقا1 :32</w:t>
+      </w:r>
+    </w:p>
+    <w:p>
+      <w:pPr>
+        <w:pStyle w:val="ListBullet"/>
+        <w:bidi/>
+        <w:spacing w:line="240" w:lineRule="auto"/>
+        <w:ind w:left="720"/>
+      </w:pPr>
+      <w:r>
+        <w:rPr>
+          <w:rtl/>
+          <w:cs/>
+          <w:lang w:val="ar_AE" w:bidi="ar_AE"/>
+        </w:rPr>
+      </w:r>
+      <w:r>
+        <w:rPr>
+          <w:rtl/>
+          <w:cs/>
+          <w:lang w:val="ar_AE" w:bidi="ar_AE"/>
+        </w:rPr>
+        <w:t>مرقس2 :26</w:t>
+      </w:r>
     </w:p>
     <w:p>
       <w:pPr>
@@ -3610,194 +3454,152 @@
           <w:lang w:val="ar_AE" w:bidi="ar_AE"/>
         </w:rPr>
       </w:r>
-      <w:hyperlink r:id="rId39">
-        <w:r>
-          <w:rPr>
-            <w:rtl/>
-            <w:cs/>
-            <w:lang w:val="ar_AE" w:bidi="ar_AE"/>
-          </w:rPr>
-          <w:rPr>
-            <w:color w:val="0000EE"/>
-            <w:u w:val="single"/>
-          </w:rPr>
-          <w:t>أخبار الأيام الثاني 3:1–3</w:t>
-        </w:r>
-      </w:hyperlink>
-    </w:p>
-    <w:p>
-      <w:pPr>
-        <w:pStyle w:val="ListBullet"/>
-        <w:bidi/>
-        <w:spacing w:line="240" w:lineRule="auto"/>
-        <w:ind w:left="720"/>
-      </w:pPr>
-      <w:r>
-        <w:rPr>
-          <w:rtl/>
-          <w:cs/>
-          <w:lang w:val="ar_AE" w:bidi="ar_AE"/>
-        </w:rPr>
-      </w:r>
-      <w:hyperlink r:id="rId40">
-        <w:r>
-          <w:rPr>
-            <w:rtl/>
-            <w:cs/>
-            <w:lang w:val="ar_AE" w:bidi="ar_AE"/>
-          </w:rPr>
-          <w:rPr>
-            <w:color w:val="0000EE"/>
-            <w:u w:val="single"/>
-          </w:rPr>
-          <w:t>ملوك الثاني 13:7</w:t>
-        </w:r>
-      </w:hyperlink>
-    </w:p>
-    <w:p>
-      <w:pPr>
-        <w:pStyle w:val="ListBullet"/>
-        <w:bidi/>
-        <w:spacing w:line="240" w:lineRule="auto"/>
-        <w:ind w:left="720"/>
-      </w:pPr>
-      <w:r>
-        <w:rPr>
-          <w:rtl/>
-          <w:cs/>
-          <w:lang w:val="ar_AE" w:bidi="ar_AE"/>
-        </w:rPr>
-      </w:r>
-      <w:hyperlink r:id="rId41">
-        <w:r>
-          <w:rPr>
-            <w:rtl/>
-            <w:cs/>
-            <w:lang w:val="ar_AE" w:bidi="ar_AE"/>
-          </w:rPr>
-          <w:rPr>
-            <w:color w:val="0000EE"/>
-            <w:u w:val="single"/>
-          </w:rPr>
-          <w:t>صموئيل الثاني 24:16</w:t>
-        </w:r>
-      </w:hyperlink>
-    </w:p>
-    <w:p>
-      <w:pPr>
-        <w:pStyle w:val="ListBullet"/>
-        <w:bidi/>
-        <w:spacing w:line="240" w:lineRule="auto"/>
-        <w:ind w:left="720"/>
-      </w:pPr>
-      <w:r>
-        <w:rPr>
-          <w:rtl/>
-          <w:cs/>
-          <w:lang w:val="ar_AE" w:bidi="ar_AE"/>
-        </w:rPr>
-      </w:r>
-      <w:hyperlink r:id="rId42">
-        <w:r>
-          <w:rPr>
-            <w:rtl/>
-            <w:cs/>
-            <w:lang w:val="ar_AE" w:bidi="ar_AE"/>
-          </w:rPr>
-          <w:rPr>
-            <w:color w:val="0000EE"/>
-            <w:u w:val="single"/>
-          </w:rPr>
-          <w:t>دانيال 2:35</w:t>
-        </w:r>
-      </w:hyperlink>
-    </w:p>
-    <w:p>
-      <w:pPr>
-        <w:pStyle w:val="ListBullet"/>
-        <w:bidi/>
-        <w:spacing w:line="240" w:lineRule="auto"/>
-        <w:ind w:left="720"/>
-      </w:pPr>
-      <w:r>
-        <w:rPr>
-          <w:rtl/>
-          <w:cs/>
-          <w:lang w:val="ar_AE" w:bidi="ar_AE"/>
-        </w:rPr>
-      </w:r>
-      <w:hyperlink r:id="rId43">
-        <w:r>
-          <w:rPr>
-            <w:rtl/>
-            <w:cs/>
-            <w:lang w:val="ar_AE" w:bidi="ar_AE"/>
-          </w:rPr>
-          <w:rPr>
-            <w:color w:val="0000EE"/>
-            <w:u w:val="single"/>
-          </w:rPr>
-          <w:t>لوقا 3:17</w:t>
-        </w:r>
-      </w:hyperlink>
-    </w:p>
-    <w:p>
-      <w:pPr>
-        <w:pStyle w:val="ListBullet"/>
-        <w:bidi/>
-        <w:spacing w:line="240" w:lineRule="auto"/>
-        <w:ind w:left="720"/>
-      </w:pPr>
-      <w:r>
-        <w:rPr>
-          <w:rtl/>
-          <w:cs/>
-          <w:lang w:val="ar_AE" w:bidi="ar_AE"/>
-        </w:rPr>
-      </w:r>
-      <w:hyperlink r:id="rId44">
-        <w:r>
-          <w:rPr>
-            <w:rtl/>
-            <w:cs/>
-            <w:lang w:val="ar_AE" w:bidi="ar_AE"/>
-          </w:rPr>
-          <w:rPr>
-            <w:color w:val="0000EE"/>
-            <w:u w:val="single"/>
-          </w:rPr>
-          <w:t>متى 3:12</w:t>
-        </w:r>
-      </w:hyperlink>
-    </w:p>
-    <w:p>
-      <w:pPr>
-        <w:pStyle w:val="ListBullet"/>
-        <w:bidi/>
-        <w:spacing w:line="240" w:lineRule="auto"/>
-        <w:ind w:left="720"/>
-      </w:pPr>
-      <w:r>
-        <w:rPr>
-          <w:rtl/>
-          <w:cs/>
-          <w:lang w:val="ar_AE" w:bidi="ar_AE"/>
-        </w:rPr>
-      </w:r>
-      <w:hyperlink r:id="rId45">
-        <w:r>
-          <w:rPr>
-            <w:rtl/>
-            <w:cs/>
-            <w:lang w:val="ar_AE" w:bidi="ar_AE"/>
-          </w:rPr>
-          <w:rPr>
-            <w:color w:val="0000EE"/>
-            <w:u w:val="single"/>
-          </w:rPr>
-          <w:t>راعوث 3:1–2</w:t>
-        </w:r>
-      </w:hyperlink>
+      <w:r>
+        <w:rPr>
+          <w:rtl/>
+          <w:cs/>
+          <w:lang w:val="ar_AE" w:bidi="ar_AE"/>
+        </w:rPr>
+        <w:t>أخبار الأيام الثاني 3:1–3</w:t>
+      </w:r>
+    </w:p>
+    <w:p>
+      <w:pPr>
+        <w:pStyle w:val="ListBullet"/>
+        <w:bidi/>
+        <w:spacing w:line="240" w:lineRule="auto"/>
+        <w:ind w:left="720"/>
+      </w:pPr>
+      <w:r>
+        <w:rPr>
+          <w:rtl/>
+          <w:cs/>
+          <w:lang w:val="ar_AE" w:bidi="ar_AE"/>
+        </w:rPr>
+      </w:r>
+      <w:r>
+        <w:rPr>
+          <w:rtl/>
+          <w:cs/>
+          <w:lang w:val="ar_AE" w:bidi="ar_AE"/>
+        </w:rPr>
+        <w:t>ملوك الثاني 13:7</w:t>
+      </w:r>
+    </w:p>
+    <w:p>
+      <w:pPr>
+        <w:pStyle w:val="ListBullet"/>
+        <w:bidi/>
+        <w:spacing w:line="240" w:lineRule="auto"/>
+        <w:ind w:left="720"/>
+      </w:pPr>
+      <w:r>
+        <w:rPr>
+          <w:rtl/>
+          <w:cs/>
+          <w:lang w:val="ar_AE" w:bidi="ar_AE"/>
+        </w:rPr>
+      </w:r>
+      <w:r>
+        <w:rPr>
+          <w:rtl/>
+          <w:cs/>
+          <w:lang w:val="ar_AE" w:bidi="ar_AE"/>
+        </w:rPr>
+        <w:t>صموئيل الثاني 24:16</w:t>
+      </w:r>
+    </w:p>
+    <w:p>
+      <w:pPr>
+        <w:pStyle w:val="ListBullet"/>
+        <w:bidi/>
+        <w:spacing w:line="240" w:lineRule="auto"/>
+        <w:ind w:left="720"/>
+      </w:pPr>
+      <w:r>
+        <w:rPr>
+          <w:rtl/>
+          <w:cs/>
+          <w:lang w:val="ar_AE" w:bidi="ar_AE"/>
+        </w:rPr>
+      </w:r>
+      <w:r>
+        <w:rPr>
+          <w:rtl/>
+          <w:cs/>
+          <w:lang w:val="ar_AE" w:bidi="ar_AE"/>
+        </w:rPr>
+        <w:t>دانيال 2:35</w:t>
+      </w:r>
+    </w:p>
+    <w:p>
+      <w:pPr>
+        <w:pStyle w:val="ListBullet"/>
+        <w:bidi/>
+        <w:spacing w:line="240" w:lineRule="auto"/>
+        <w:ind w:left="720"/>
+      </w:pPr>
+      <w:r>
+        <w:rPr>
+          <w:rtl/>
+          <w:cs/>
+          <w:lang w:val="ar_AE" w:bidi="ar_AE"/>
+        </w:rPr>
+      </w:r>
+      <w:r>
+        <w:rPr>
+          <w:rtl/>
+          <w:cs/>
+          <w:lang w:val="ar_AE" w:bidi="ar_AE"/>
+        </w:rPr>
+        <w:t>لوقا 3:17</w:t>
+      </w:r>
+    </w:p>
+    <w:p>
+      <w:pPr>
+        <w:pStyle w:val="ListBullet"/>
+        <w:bidi/>
+        <w:spacing w:line="240" w:lineRule="auto"/>
+        <w:ind w:left="720"/>
+      </w:pPr>
+      <w:r>
+        <w:rPr>
+          <w:rtl/>
+          <w:cs/>
+          <w:lang w:val="ar_AE" w:bidi="ar_AE"/>
+        </w:rPr>
+      </w:r>
+      <w:r>
+        <w:rPr>
+          <w:rtl/>
+          <w:cs/>
+          <w:lang w:val="ar_AE" w:bidi="ar_AE"/>
+        </w:rPr>
+        <w:t>متى 3:12</w:t>
+      </w:r>
+    </w:p>
+    <w:p>
+      <w:pPr>
+        <w:pStyle w:val="ListBullet"/>
+        <w:bidi/>
+        <w:spacing w:line="240" w:lineRule="auto"/>
+        <w:ind w:left="720"/>
+      </w:pPr>
+      <w:r>
+        <w:rPr>
+          <w:rtl/>
+          <w:cs/>
+          <w:lang w:val="ar_AE" w:bidi="ar_AE"/>
+        </w:rPr>
+      </w:r>
+      <w:r>
+        <w:rPr>
+          <w:rtl/>
+          <w:cs/>
+          <w:lang w:val="ar_AE" w:bidi="ar_AE"/>
+        </w:rPr>
+        <w:t>راعوث 3:1–2</w:t>
+      </w:r>
     </w:p>
     <w:p>
       <w:pPr>
@@ -4153,107 +3955,83 @@
           <w:lang w:val="ar_AE" w:bidi="ar_AE"/>
         </w:rPr>
       </w:r>
-      <w:hyperlink r:id="rId46">
-        <w:r>
-          <w:rPr>
-            <w:rtl/>
-            <w:cs/>
-            <w:lang w:val="ar_AE" w:bidi="ar_AE"/>
-          </w:rPr>
-          <w:rPr>
-            <w:color w:val="0000EE"/>
-            <w:u w:val="single"/>
-          </w:rPr>
-          <w:t>1 تسالونيكي 5: 8</w:t>
-        </w:r>
-      </w:hyperlink>
-    </w:p>
-    <w:p>
-      <w:pPr>
-        <w:pStyle w:val="ListBullet"/>
-        <w:bidi/>
-        <w:spacing w:line="240" w:lineRule="auto"/>
-        <w:ind w:left="720"/>
-      </w:pPr>
-      <w:r>
-        <w:rPr>
-          <w:rtl/>
-          <w:cs/>
-          <w:lang w:val="ar_AE" w:bidi="ar_AE"/>
-        </w:rPr>
-      </w:r>
-      <w:hyperlink r:id="rId47">
-        <w:r>
-          <w:rPr>
-            <w:rtl/>
-            <w:cs/>
-            <w:lang w:val="ar_AE" w:bidi="ar_AE"/>
-          </w:rPr>
-          <w:rPr>
-            <w:color w:val="0000EE"/>
-            <w:u w:val="single"/>
-          </w:rPr>
-          <w:t>خروج 39: 14–16</w:t>
-        </w:r>
-      </w:hyperlink>
-    </w:p>
-    <w:p>
-      <w:pPr>
-        <w:pStyle w:val="ListBullet"/>
-        <w:bidi/>
-        <w:spacing w:line="240" w:lineRule="auto"/>
-        <w:ind w:left="720"/>
-      </w:pPr>
-      <w:r>
-        <w:rPr>
-          <w:rtl/>
-          <w:cs/>
-          <w:lang w:val="ar_AE" w:bidi="ar_AE"/>
-        </w:rPr>
-      </w:r>
-      <w:hyperlink r:id="rId48">
-        <w:r>
-          <w:rPr>
-            <w:rtl/>
-            <w:cs/>
-            <w:lang w:val="ar_AE" w:bidi="ar_AE"/>
-          </w:rPr>
-          <w:rPr>
-            <w:color w:val="0000EE"/>
-            <w:u w:val="single"/>
-          </w:rPr>
-          <w:t>إشعياء 59: 17</w:t>
-        </w:r>
-      </w:hyperlink>
-    </w:p>
-    <w:p>
-      <w:pPr>
-        <w:pStyle w:val="ListBullet"/>
-        <w:bidi/>
-        <w:spacing w:line="240" w:lineRule="auto"/>
-        <w:ind w:left="720"/>
-      </w:pPr>
-      <w:r>
-        <w:rPr>
-          <w:rtl/>
-          <w:cs/>
-          <w:lang w:val="ar_AE" w:bidi="ar_AE"/>
-        </w:rPr>
-      </w:r>
-      <w:hyperlink r:id="rId49">
-        <w:r>
-          <w:rPr>
-            <w:rtl/>
-            <w:cs/>
-            <w:lang w:val="ar_AE" w:bidi="ar_AE"/>
-          </w:rPr>
-          <w:rPr>
-            <w:color w:val="0000EE"/>
-            <w:u w:val="single"/>
-          </w:rPr>
-          <w:t>رؤيا 9: 7–9</w:t>
-        </w:r>
-      </w:hyperlink>
+      <w:r>
+        <w:rPr>
+          <w:rtl/>
+          <w:cs/>
+          <w:lang w:val="ar_AE" w:bidi="ar_AE"/>
+        </w:rPr>
+        <w:t>1 تسالونيكي 5: 8</w:t>
+      </w:r>
+    </w:p>
+    <w:p>
+      <w:pPr>
+        <w:pStyle w:val="ListBullet"/>
+        <w:bidi/>
+        <w:spacing w:line="240" w:lineRule="auto"/>
+        <w:ind w:left="720"/>
+      </w:pPr>
+      <w:r>
+        <w:rPr>
+          <w:rtl/>
+          <w:cs/>
+          <w:lang w:val="ar_AE" w:bidi="ar_AE"/>
+        </w:rPr>
+      </w:r>
+      <w:r>
+        <w:rPr>
+          <w:rtl/>
+          <w:cs/>
+          <w:lang w:val="ar_AE" w:bidi="ar_AE"/>
+        </w:rPr>
+        <w:t>خروج 39: 14–16</w:t>
+      </w:r>
+    </w:p>
+    <w:p>
+      <w:pPr>
+        <w:pStyle w:val="ListBullet"/>
+        <w:bidi/>
+        <w:spacing w:line="240" w:lineRule="auto"/>
+        <w:ind w:left="720"/>
+      </w:pPr>
+      <w:r>
+        <w:rPr>
+          <w:rtl/>
+          <w:cs/>
+          <w:lang w:val="ar_AE" w:bidi="ar_AE"/>
+        </w:rPr>
+      </w:r>
+      <w:r>
+        <w:rPr>
+          <w:rtl/>
+          <w:cs/>
+          <w:lang w:val="ar_AE" w:bidi="ar_AE"/>
+        </w:rPr>
+        <w:t>إشعياء 59: 17</w:t>
+      </w:r>
+    </w:p>
+    <w:p>
+      <w:pPr>
+        <w:pStyle w:val="ListBullet"/>
+        <w:bidi/>
+        <w:spacing w:line="240" w:lineRule="auto"/>
+        <w:ind w:left="720"/>
+      </w:pPr>
+      <w:r>
+        <w:rPr>
+          <w:rtl/>
+          <w:cs/>
+          <w:lang w:val="ar_AE" w:bidi="ar_AE"/>
+        </w:rPr>
+      </w:r>
+      <w:r>
+        <w:rPr>
+          <w:rtl/>
+          <w:cs/>
+          <w:lang w:val="ar_AE" w:bidi="ar_AE"/>
+        </w:rPr>
+        <w:t>رؤيا 9: 7–9</w:t>
+      </w:r>
     </w:p>
     <w:p>
       <w:pPr>
@@ -4584,107 +4362,83 @@
           <w:lang w:val="ar_AE" w:bidi="ar_AE"/>
         </w:rPr>
       </w:r>
-      <w:hyperlink r:id="rId50">
-        <w:r>
-          <w:rPr>
-            <w:rtl/>
-            <w:cs/>
-            <w:lang w:val="ar_AE" w:bidi="ar_AE"/>
-          </w:rPr>
-          <w:rPr>
-            <w:color w:val="0000EE"/>
-            <w:u w:val="single"/>
-          </w:rPr>
-          <w:t>1 أخبار الأيام 23: 27–29</w:t>
-        </w:r>
-      </w:hyperlink>
-    </w:p>
-    <w:p>
-      <w:pPr>
-        <w:pStyle w:val="ListBullet"/>
-        <w:bidi/>
-        <w:spacing w:line="240" w:lineRule="auto"/>
-        <w:ind w:left="720"/>
-      </w:pPr>
-      <w:r>
-        <w:rPr>
-          <w:rtl/>
-          <w:cs/>
-          <w:lang w:val="ar_AE" w:bidi="ar_AE"/>
-        </w:rPr>
-      </w:r>
-      <w:hyperlink r:id="rId51">
-        <w:r>
-          <w:rPr>
-            <w:rtl/>
-            <w:cs/>
-            <w:lang w:val="ar_AE" w:bidi="ar_AE"/>
-          </w:rPr>
-          <w:rPr>
-            <w:color w:val="0000EE"/>
-            <w:u w:val="single"/>
-          </w:rPr>
-          <w:t>خروج 29: 41–42</w:t>
-        </w:r>
-      </w:hyperlink>
-    </w:p>
-    <w:p>
-      <w:pPr>
-        <w:pStyle w:val="ListBullet"/>
-        <w:bidi/>
-        <w:spacing w:line="240" w:lineRule="auto"/>
-        <w:ind w:left="720"/>
-      </w:pPr>
-      <w:r>
-        <w:rPr>
-          <w:rtl/>
-          <w:cs/>
-          <w:lang w:val="ar_AE" w:bidi="ar_AE"/>
-        </w:rPr>
-      </w:r>
-      <w:hyperlink r:id="rId52">
-        <w:r>
-          <w:rPr>
-            <w:rtl/>
-            <w:cs/>
-            <w:lang w:val="ar_AE" w:bidi="ar_AE"/>
-          </w:rPr>
-          <w:rPr>
-            <w:color w:val="0000EE"/>
-            <w:u w:val="single"/>
-          </w:rPr>
-          <w:t>قضاة 13: 19</w:t>
-        </w:r>
-      </w:hyperlink>
-    </w:p>
-    <w:p>
-      <w:pPr>
-        <w:pStyle w:val="ListBullet"/>
-        <w:bidi/>
-        <w:spacing w:line="240" w:lineRule="auto"/>
-        <w:ind w:left="720"/>
-      </w:pPr>
-      <w:r>
-        <w:rPr>
-          <w:rtl/>
-          <w:cs/>
-          <w:lang w:val="ar_AE" w:bidi="ar_AE"/>
-        </w:rPr>
-      </w:r>
-      <w:hyperlink r:id="rId53">
-        <w:r>
-          <w:rPr>
-            <w:rtl/>
-            <w:cs/>
-            <w:lang w:val="ar_AE" w:bidi="ar_AE"/>
-          </w:rPr>
-          <w:rPr>
-            <w:color w:val="0000EE"/>
-            <w:u w:val="single"/>
-          </w:rPr>
-          <w:t>لاويين 2: 2</w:t>
-        </w:r>
-      </w:hyperlink>
+      <w:r>
+        <w:rPr>
+          <w:rtl/>
+          <w:cs/>
+          <w:lang w:val="ar_AE" w:bidi="ar_AE"/>
+        </w:rPr>
+        <w:t>1 أخبار الأيام 23: 27–29</w:t>
+      </w:r>
+    </w:p>
+    <w:p>
+      <w:pPr>
+        <w:pStyle w:val="ListBullet"/>
+        <w:bidi/>
+        <w:spacing w:line="240" w:lineRule="auto"/>
+        <w:ind w:left="720"/>
+      </w:pPr>
+      <w:r>
+        <w:rPr>
+          <w:rtl/>
+          <w:cs/>
+          <w:lang w:val="ar_AE" w:bidi="ar_AE"/>
+        </w:rPr>
+      </w:r>
+      <w:r>
+        <w:rPr>
+          <w:rtl/>
+          <w:cs/>
+          <w:lang w:val="ar_AE" w:bidi="ar_AE"/>
+        </w:rPr>
+        <w:t>خروج 29: 41–42</w:t>
+      </w:r>
+    </w:p>
+    <w:p>
+      <w:pPr>
+        <w:pStyle w:val="ListBullet"/>
+        <w:bidi/>
+        <w:spacing w:line="240" w:lineRule="auto"/>
+        <w:ind w:left="720"/>
+      </w:pPr>
+      <w:r>
+        <w:rPr>
+          <w:rtl/>
+          <w:cs/>
+          <w:lang w:val="ar_AE" w:bidi="ar_AE"/>
+        </w:rPr>
+      </w:r>
+      <w:r>
+        <w:rPr>
+          <w:rtl/>
+          <w:cs/>
+          <w:lang w:val="ar_AE" w:bidi="ar_AE"/>
+        </w:rPr>
+        <w:t>قضاة 13: 19</w:t>
+      </w:r>
+    </w:p>
+    <w:p>
+      <w:pPr>
+        <w:pStyle w:val="ListBullet"/>
+        <w:bidi/>
+        <w:spacing w:line="240" w:lineRule="auto"/>
+        <w:ind w:left="720"/>
+      </w:pPr>
+      <w:r>
+        <w:rPr>
+          <w:rtl/>
+          <w:cs/>
+          <w:lang w:val="ar_AE" w:bidi="ar_AE"/>
+        </w:rPr>
+      </w:r>
+      <w:r>
+        <w:rPr>
+          <w:rtl/>
+          <w:cs/>
+          <w:lang w:val="ar_AE" w:bidi="ar_AE"/>
+        </w:rPr>
+        <w:t>لاويين 2: 2</w:t>
+      </w:r>
     </w:p>
     <w:p>
       <w:pPr>
@@ -4966,107 +4720,83 @@
           <w:lang w:val="ar_AE" w:bidi="ar_AE"/>
         </w:rPr>
       </w:r>
-      <w:hyperlink r:id="rId54">
-        <w:r>
-          <w:rPr>
-            <w:rtl/>
-            <w:cs/>
-            <w:lang w:val="ar_AE" w:bidi="ar_AE"/>
-          </w:rPr>
-          <w:rPr>
-            <w:color w:val="0000EE"/>
-            <w:u w:val="single"/>
-          </w:rPr>
-          <w:t>قضاة 16: 4–5</w:t>
-        </w:r>
-      </w:hyperlink>
-    </w:p>
-    <w:p>
-      <w:pPr>
-        <w:pStyle w:val="ListBullet"/>
-        <w:bidi/>
-        <w:spacing w:line="240" w:lineRule="auto"/>
-        <w:ind w:left="720"/>
-      </w:pPr>
-      <w:r>
-        <w:rPr>
-          <w:rtl/>
-          <w:cs/>
-          <w:lang w:val="ar_AE" w:bidi="ar_AE"/>
-        </w:rPr>
-      </w:r>
-      <w:hyperlink r:id="rId55">
-        <w:r>
-          <w:rPr>
-            <w:rtl/>
-            <w:cs/>
-            <w:lang w:val="ar_AE" w:bidi="ar_AE"/>
-          </w:rPr>
-          <w:rPr>
-            <w:color w:val="0000EE"/>
-            <w:u w:val="single"/>
-          </w:rPr>
-          <w:t>قضاة 16: 6–7</w:t>
-        </w:r>
-      </w:hyperlink>
-    </w:p>
-    <w:p>
-      <w:pPr>
-        <w:pStyle w:val="ListBullet"/>
-        <w:bidi/>
-        <w:spacing w:line="240" w:lineRule="auto"/>
-        <w:ind w:left="720"/>
-      </w:pPr>
-      <w:r>
-        <w:rPr>
-          <w:rtl/>
-          <w:cs/>
-          <w:lang w:val="ar_AE" w:bidi="ar_AE"/>
-        </w:rPr>
-      </w:r>
-      <w:hyperlink r:id="rId56">
-        <w:r>
-          <w:rPr>
-            <w:rtl/>
-            <w:cs/>
-            <w:lang w:val="ar_AE" w:bidi="ar_AE"/>
-          </w:rPr>
-          <w:rPr>
-            <w:color w:val="0000EE"/>
-            <w:u w:val="single"/>
-          </w:rPr>
-          <w:t>قضاة 16: 10</w:t>
-        </w:r>
-      </w:hyperlink>
-    </w:p>
-    <w:p>
-      <w:pPr>
-        <w:pStyle w:val="ListBullet"/>
-        <w:bidi/>
-        <w:spacing w:line="240" w:lineRule="auto"/>
-        <w:ind w:left="720"/>
-      </w:pPr>
-      <w:r>
-        <w:rPr>
-          <w:rtl/>
-          <w:cs/>
-          <w:lang w:val="ar_AE" w:bidi="ar_AE"/>
-        </w:rPr>
-      </w:r>
-      <w:hyperlink r:id="rId57">
-        <w:r>
-          <w:rPr>
-            <w:rtl/>
-            <w:cs/>
-            <w:lang w:val="ar_AE" w:bidi="ar_AE"/>
-          </w:rPr>
-          <w:rPr>
-            <w:color w:val="0000EE"/>
-            <w:u w:val="single"/>
-          </w:rPr>
-          <w:t>قضاة 16: 18</w:t>
-        </w:r>
-      </w:hyperlink>
+      <w:r>
+        <w:rPr>
+          <w:rtl/>
+          <w:cs/>
+          <w:lang w:val="ar_AE" w:bidi="ar_AE"/>
+        </w:rPr>
+        <w:t>قضاة 16: 4–5</w:t>
+      </w:r>
+    </w:p>
+    <w:p>
+      <w:pPr>
+        <w:pStyle w:val="ListBullet"/>
+        <w:bidi/>
+        <w:spacing w:line="240" w:lineRule="auto"/>
+        <w:ind w:left="720"/>
+      </w:pPr>
+      <w:r>
+        <w:rPr>
+          <w:rtl/>
+          <w:cs/>
+          <w:lang w:val="ar_AE" w:bidi="ar_AE"/>
+        </w:rPr>
+      </w:r>
+      <w:r>
+        <w:rPr>
+          <w:rtl/>
+          <w:cs/>
+          <w:lang w:val="ar_AE" w:bidi="ar_AE"/>
+        </w:rPr>
+        <w:t>قضاة 16: 6–7</w:t>
+      </w:r>
+    </w:p>
+    <w:p>
+      <w:pPr>
+        <w:pStyle w:val="ListBullet"/>
+        <w:bidi/>
+        <w:spacing w:line="240" w:lineRule="auto"/>
+        <w:ind w:left="720"/>
+      </w:pPr>
+      <w:r>
+        <w:rPr>
+          <w:rtl/>
+          <w:cs/>
+          <w:lang w:val="ar_AE" w:bidi="ar_AE"/>
+        </w:rPr>
+      </w:r>
+      <w:r>
+        <w:rPr>
+          <w:rtl/>
+          <w:cs/>
+          <w:lang w:val="ar_AE" w:bidi="ar_AE"/>
+        </w:rPr>
+        <w:t>قضاة 16: 10</w:t>
+      </w:r>
+    </w:p>
+    <w:p>
+      <w:pPr>
+        <w:pStyle w:val="ListBullet"/>
+        <w:bidi/>
+        <w:spacing w:line="240" w:lineRule="auto"/>
+        <w:ind w:left="720"/>
+      </w:pPr>
+      <w:r>
+        <w:rPr>
+          <w:rtl/>
+          <w:cs/>
+          <w:lang w:val="ar_AE" w:bidi="ar_AE"/>
+        </w:rPr>
+      </w:r>
+      <w:r>
+        <w:rPr>
+          <w:rtl/>
+          <w:cs/>
+          <w:lang w:val="ar_AE" w:bidi="ar_AE"/>
+        </w:rPr>
+        <w:t>قضاة 16: 18</w:t>
+      </w:r>
     </w:p>
     <w:p>
       <w:pPr>
@@ -5433,165 +5163,129 @@
           <w:lang w:val="ar_AE" w:bidi="ar_AE"/>
         </w:rPr>
       </w:r>
-      <w:hyperlink r:id="rId58">
-        <w:r>
-          <w:rPr>
-            <w:rtl/>
-            <w:cs/>
-            <w:lang w:val="ar_AE" w:bidi="ar_AE"/>
-          </w:rPr>
-          <w:rPr>
-            <w:color w:val="0000EE"/>
-            <w:u w:val="single"/>
-          </w:rPr>
-          <w:t>أخبار الأيام الثاني24: 23–24</w:t>
-        </w:r>
-      </w:hyperlink>
-    </w:p>
-    <w:p>
-      <w:pPr>
-        <w:pStyle w:val="ListBullet"/>
-        <w:bidi/>
-        <w:spacing w:line="240" w:lineRule="auto"/>
-        <w:ind w:left="720"/>
-      </w:pPr>
-      <w:r>
-        <w:rPr>
-          <w:rtl/>
-          <w:cs/>
-          <w:lang w:val="ar_AE" w:bidi="ar_AE"/>
-        </w:rPr>
-      </w:r>
-      <w:hyperlink r:id="rId59">
-        <w:r>
-          <w:rPr>
-            <w:rtl/>
-            <w:cs/>
-            <w:lang w:val="ar_AE" w:bidi="ar_AE"/>
-          </w:rPr>
-          <w:rPr>
-            <w:color w:val="0000EE"/>
-            <w:u w:val="single"/>
-          </w:rPr>
-          <w:t>أعمال الرسل 9:1–2</w:t>
-        </w:r>
-      </w:hyperlink>
-    </w:p>
-    <w:p>
-      <w:pPr>
-        <w:pStyle w:val="ListBullet"/>
-        <w:bidi/>
-        <w:spacing w:line="240" w:lineRule="auto"/>
-        <w:ind w:left="720"/>
-      </w:pPr>
-      <w:r>
-        <w:rPr>
-          <w:rtl/>
-          <w:cs/>
-          <w:lang w:val="ar_AE" w:bidi="ar_AE"/>
-        </w:rPr>
-      </w:r>
-      <w:hyperlink r:id="rId60">
-        <w:r>
-          <w:rPr>
-            <w:rtl/>
-            <w:cs/>
-            <w:lang w:val="ar_AE" w:bidi="ar_AE"/>
-          </w:rPr>
-          <w:rPr>
-            <w:color w:val="0000EE"/>
-            <w:u w:val="single"/>
-          </w:rPr>
-          <w:t>أعمال الرسل 9:3</w:t>
-        </w:r>
-      </w:hyperlink>
-    </w:p>
-    <w:p>
-      <w:pPr>
-        <w:pStyle w:val="ListBullet"/>
-        <w:bidi/>
-        <w:spacing w:line="240" w:lineRule="auto"/>
-        <w:ind w:left="720"/>
-      </w:pPr>
-      <w:r>
-        <w:rPr>
-          <w:rtl/>
-          <w:cs/>
-          <w:lang w:val="ar_AE" w:bidi="ar_AE"/>
-        </w:rPr>
-      </w:r>
-      <w:hyperlink r:id="rId61">
-        <w:r>
-          <w:rPr>
-            <w:rtl/>
-            <w:cs/>
-            <w:lang w:val="ar_AE" w:bidi="ar_AE"/>
-          </w:rPr>
-          <w:rPr>
-            <w:color w:val="0000EE"/>
-            <w:u w:val="single"/>
-          </w:rPr>
-          <w:t>أعمال الرسل 26:12</w:t>
-        </w:r>
-      </w:hyperlink>
-    </w:p>
-    <w:p>
-      <w:pPr>
-        <w:pStyle w:val="ListBullet"/>
-        <w:bidi/>
-        <w:spacing w:line="240" w:lineRule="auto"/>
-        <w:ind w:left="720"/>
-      </w:pPr>
-      <w:r>
-        <w:rPr>
-          <w:rtl/>
-          <w:cs/>
-          <w:lang w:val="ar_AE" w:bidi="ar_AE"/>
-        </w:rPr>
-      </w:r>
-      <w:hyperlink r:id="rId62">
-        <w:r>
-          <w:rPr>
-            <w:rtl/>
-            <w:cs/>
-            <w:lang w:val="ar_AE" w:bidi="ar_AE"/>
-          </w:rPr>
-          <w:rPr>
-            <w:color w:val="0000EE"/>
-            <w:u w:val="single"/>
-          </w:rPr>
-          <w:t>غلاطية 1:15–17</w:t>
-        </w:r>
-      </w:hyperlink>
-    </w:p>
-    <w:p>
-      <w:pPr>
-        <w:pStyle w:val="ListBullet"/>
-        <w:bidi/>
-        <w:spacing w:line="240" w:lineRule="auto"/>
-        <w:ind w:left="720"/>
-      </w:pPr>
-      <w:r>
-        <w:rPr>
-          <w:rtl/>
-          <w:cs/>
-          <w:lang w:val="ar_AE" w:bidi="ar_AE"/>
-        </w:rPr>
-      </w:r>
-      <w:hyperlink r:id="rId63">
-        <w:r>
-          <w:rPr>
-            <w:rtl/>
-            <w:cs/>
-            <w:lang w:val="ar_AE" w:bidi="ar_AE"/>
-          </w:rPr>
-          <w:rPr>
-            <w:color w:val="0000EE"/>
-            <w:u w:val="single"/>
-          </w:rPr>
-          <w:t>تكوين 14:15–16</w:t>
-        </w:r>
-      </w:hyperlink>
+      <w:r>
+        <w:rPr>
+          <w:rtl/>
+          <w:cs/>
+          <w:lang w:val="ar_AE" w:bidi="ar_AE"/>
+        </w:rPr>
+        <w:t>أخبار الأيام الثاني24: 23–24</w:t>
+      </w:r>
+    </w:p>
+    <w:p>
+      <w:pPr>
+        <w:pStyle w:val="ListBullet"/>
+        <w:bidi/>
+        <w:spacing w:line="240" w:lineRule="auto"/>
+        <w:ind w:left="720"/>
+      </w:pPr>
+      <w:r>
+        <w:rPr>
+          <w:rtl/>
+          <w:cs/>
+          <w:lang w:val="ar_AE" w:bidi="ar_AE"/>
+        </w:rPr>
+      </w:r>
+      <w:r>
+        <w:rPr>
+          <w:rtl/>
+          <w:cs/>
+          <w:lang w:val="ar_AE" w:bidi="ar_AE"/>
+        </w:rPr>
+        <w:t>أعمال الرسل 9:1–2</w:t>
+      </w:r>
+    </w:p>
+    <w:p>
+      <w:pPr>
+        <w:pStyle w:val="ListBullet"/>
+        <w:bidi/>
+        <w:spacing w:line="240" w:lineRule="auto"/>
+        <w:ind w:left="720"/>
+      </w:pPr>
+      <w:r>
+        <w:rPr>
+          <w:rtl/>
+          <w:cs/>
+          <w:lang w:val="ar_AE" w:bidi="ar_AE"/>
+        </w:rPr>
+      </w:r>
+      <w:r>
+        <w:rPr>
+          <w:rtl/>
+          <w:cs/>
+          <w:lang w:val="ar_AE" w:bidi="ar_AE"/>
+        </w:rPr>
+        <w:t>أعمال الرسل 9:3</w:t>
+      </w:r>
+    </w:p>
+    <w:p>
+      <w:pPr>
+        <w:pStyle w:val="ListBullet"/>
+        <w:bidi/>
+        <w:spacing w:line="240" w:lineRule="auto"/>
+        <w:ind w:left="720"/>
+      </w:pPr>
+      <w:r>
+        <w:rPr>
+          <w:rtl/>
+          <w:cs/>
+          <w:lang w:val="ar_AE" w:bidi="ar_AE"/>
+        </w:rPr>
+      </w:r>
+      <w:r>
+        <w:rPr>
+          <w:rtl/>
+          <w:cs/>
+          <w:lang w:val="ar_AE" w:bidi="ar_AE"/>
+        </w:rPr>
+        <w:t>أعمال الرسل 26:12</w:t>
+      </w:r>
+    </w:p>
+    <w:p>
+      <w:pPr>
+        <w:pStyle w:val="ListBullet"/>
+        <w:bidi/>
+        <w:spacing w:line="240" w:lineRule="auto"/>
+        <w:ind w:left="720"/>
+      </w:pPr>
+      <w:r>
+        <w:rPr>
+          <w:rtl/>
+          <w:cs/>
+          <w:lang w:val="ar_AE" w:bidi="ar_AE"/>
+        </w:rPr>
+      </w:r>
+      <w:r>
+        <w:rPr>
+          <w:rtl/>
+          <w:cs/>
+          <w:lang w:val="ar_AE" w:bidi="ar_AE"/>
+        </w:rPr>
+        <w:t>غلاطية 1:15–17</w:t>
+      </w:r>
+    </w:p>
+    <w:p>
+      <w:pPr>
+        <w:pStyle w:val="ListBullet"/>
+        <w:bidi/>
+        <w:spacing w:line="240" w:lineRule="auto"/>
+        <w:ind w:left="720"/>
+      </w:pPr>
+      <w:r>
+        <w:rPr>
+          <w:rtl/>
+          <w:cs/>
+          <w:lang w:val="ar_AE" w:bidi="ar_AE"/>
+        </w:rPr>
+      </w:r>
+      <w:r>
+        <w:rPr>
+          <w:rtl/>
+          <w:cs/>
+          <w:lang w:val="ar_AE" w:bidi="ar_AE"/>
+        </w:rPr>
+        <w:t>تكوين 14:15–16</w:t>
+      </w:r>
     </w:p>
     <w:p>
       <w:pPr>
@@ -5966,223 +5660,175 @@
           <w:lang w:val="ar_AE" w:bidi="ar_AE"/>
         </w:rPr>
       </w:r>
-      <w:hyperlink r:id="rId64">
-        <w:r>
-          <w:rPr>
-            <w:rtl/>
-            <w:cs/>
-            <w:lang w:val="ar_AE" w:bidi="ar_AE"/>
-          </w:rPr>
-          <w:rPr>
-            <w:color w:val="0000EE"/>
-            <w:u w:val="single"/>
-          </w:rPr>
-          <w:t>الملوك الثاني23 :8</w:t>
-        </w:r>
-      </w:hyperlink>
-    </w:p>
-    <w:p>
-      <w:pPr>
-        <w:pStyle w:val="ListBullet"/>
-        <w:bidi/>
-        <w:spacing w:line="240" w:lineRule="auto"/>
-        <w:ind w:left="720"/>
-      </w:pPr>
-      <w:r>
-        <w:rPr>
-          <w:rtl/>
-          <w:cs/>
-          <w:lang w:val="ar_AE" w:bidi="ar_AE"/>
-        </w:rPr>
-      </w:r>
-      <w:hyperlink r:id="rId65">
-        <w:r>
-          <w:rPr>
-            <w:rtl/>
-            <w:cs/>
-            <w:lang w:val="ar_AE" w:bidi="ar_AE"/>
-          </w:rPr>
-          <w:rPr>
-            <w:color w:val="0000EE"/>
-            <w:u w:val="single"/>
-          </w:rPr>
-          <w:t>خروج20 :24–26</w:t>
-        </w:r>
-      </w:hyperlink>
-    </w:p>
-    <w:p>
-      <w:pPr>
-        <w:pStyle w:val="ListBullet"/>
-        <w:bidi/>
-        <w:spacing w:line="240" w:lineRule="auto"/>
-        <w:ind w:left="720"/>
-      </w:pPr>
-      <w:r>
-        <w:rPr>
-          <w:rtl/>
-          <w:cs/>
-          <w:lang w:val="ar_AE" w:bidi="ar_AE"/>
-        </w:rPr>
-      </w:r>
-      <w:hyperlink r:id="rId66">
-        <w:r>
-          <w:rPr>
-            <w:rtl/>
-            <w:cs/>
-            <w:lang w:val="ar_AE" w:bidi="ar_AE"/>
-          </w:rPr>
-          <w:rPr>
-            <w:color w:val="0000EE"/>
-            <w:u w:val="single"/>
-          </w:rPr>
-          <w:t>تكوين34 :27</w:t>
-        </w:r>
-      </w:hyperlink>
-    </w:p>
-    <w:p>
-      <w:pPr>
-        <w:pStyle w:val="ListBullet"/>
-        <w:bidi/>
-        <w:spacing w:line="240" w:lineRule="auto"/>
-        <w:ind w:left="720"/>
-      </w:pPr>
-      <w:r>
-        <w:rPr>
-          <w:rtl/>
-          <w:cs/>
-          <w:lang w:val="ar_AE" w:bidi="ar_AE"/>
-        </w:rPr>
-      </w:r>
-      <w:hyperlink r:id="rId67">
-        <w:r>
-          <w:rPr>
-            <w:rtl/>
-            <w:cs/>
-            <w:lang w:val="ar_AE" w:bidi="ar_AE"/>
-          </w:rPr>
-          <w:rPr>
-            <w:color w:val="0000EE"/>
-            <w:u w:val="single"/>
-          </w:rPr>
-          <w:t>تكوين49 :4</w:t>
-        </w:r>
-      </w:hyperlink>
-    </w:p>
-    <w:p>
-      <w:pPr>
-        <w:pStyle w:val="ListBullet"/>
-        <w:bidi/>
-        <w:spacing w:line="240" w:lineRule="auto"/>
-        <w:ind w:left="720"/>
-      </w:pPr>
-      <w:r>
-        <w:rPr>
-          <w:rtl/>
-          <w:cs/>
-          <w:lang w:val="ar_AE" w:bidi="ar_AE"/>
-        </w:rPr>
-      </w:r>
-      <w:hyperlink r:id="rId68">
-        <w:r>
-          <w:rPr>
-            <w:rtl/>
-            <w:cs/>
-            <w:lang w:val="ar_AE" w:bidi="ar_AE"/>
-          </w:rPr>
-          <w:rPr>
-            <w:color w:val="0000EE"/>
-            <w:u w:val="single"/>
-          </w:rPr>
-          <w:t>إشعياء43 :27–28</w:t>
-        </w:r>
-      </w:hyperlink>
-    </w:p>
-    <w:p>
-      <w:pPr>
-        <w:pStyle w:val="ListBullet"/>
-        <w:bidi/>
-        <w:spacing w:line="240" w:lineRule="auto"/>
-        <w:ind w:left="720"/>
-      </w:pPr>
-      <w:r>
-        <w:rPr>
-          <w:rtl/>
-          <w:cs/>
-          <w:lang w:val="ar_AE" w:bidi="ar_AE"/>
-        </w:rPr>
-      </w:r>
-      <w:hyperlink r:id="rId69">
-        <w:r>
-          <w:rPr>
-            <w:rtl/>
-            <w:cs/>
-            <w:lang w:val="ar_AE" w:bidi="ar_AE"/>
-          </w:rPr>
-          <w:rPr>
-            <w:color w:val="0000EE"/>
-            <w:u w:val="single"/>
-          </w:rPr>
-          <w:t>اللاويين11 :43–45</w:t>
-        </w:r>
-      </w:hyperlink>
-    </w:p>
-    <w:p>
-      <w:pPr>
-        <w:pStyle w:val="ListBullet"/>
-        <w:bidi/>
-        <w:spacing w:line="240" w:lineRule="auto"/>
-        <w:ind w:left="720"/>
-      </w:pPr>
-      <w:r>
-        <w:rPr>
-          <w:rtl/>
-          <w:cs/>
-          <w:lang w:val="ar_AE" w:bidi="ar_AE"/>
-        </w:rPr>
-      </w:r>
-      <w:hyperlink r:id="rId70">
-        <w:r>
-          <w:rPr>
-            <w:rtl/>
-            <w:cs/>
-            <w:lang w:val="ar_AE" w:bidi="ar_AE"/>
-          </w:rPr>
-          <w:rPr>
-            <w:color w:val="0000EE"/>
-            <w:u w:val="single"/>
-          </w:rPr>
-          <w:t>مرقس7 :14–16</w:t>
-        </w:r>
-      </w:hyperlink>
-    </w:p>
-    <w:p>
-      <w:pPr>
-        <w:pStyle w:val="ListBullet"/>
-        <w:bidi/>
-        <w:spacing w:line="240" w:lineRule="auto"/>
-        <w:ind w:left="720"/>
-      </w:pPr>
-      <w:r>
-        <w:rPr>
-          <w:rtl/>
-          <w:cs/>
-          <w:lang w:val="ar_AE" w:bidi="ar_AE"/>
-        </w:rPr>
-      </w:r>
-      <w:hyperlink r:id="rId71">
-        <w:r>
-          <w:rPr>
-            <w:rtl/>
-            <w:cs/>
-            <w:lang w:val="ar_AE" w:bidi="ar_AE"/>
-          </w:rPr>
-          <w:rPr>
-            <w:color w:val="0000EE"/>
-            <w:u w:val="single"/>
-          </w:rPr>
-          <w:t>متى15 :10</w:t>
-        </w:r>
-      </w:hyperlink>
+      <w:r>
+        <w:rPr>
+          <w:rtl/>
+          <w:cs/>
+          <w:lang w:val="ar_AE" w:bidi="ar_AE"/>
+        </w:rPr>
+        <w:t>الملوك الثاني23 :8</w:t>
+      </w:r>
+    </w:p>
+    <w:p>
+      <w:pPr>
+        <w:pStyle w:val="ListBullet"/>
+        <w:bidi/>
+        <w:spacing w:line="240" w:lineRule="auto"/>
+        <w:ind w:left="720"/>
+      </w:pPr>
+      <w:r>
+        <w:rPr>
+          <w:rtl/>
+          <w:cs/>
+          <w:lang w:val="ar_AE" w:bidi="ar_AE"/>
+        </w:rPr>
+      </w:r>
+      <w:r>
+        <w:rPr>
+          <w:rtl/>
+          <w:cs/>
+          <w:lang w:val="ar_AE" w:bidi="ar_AE"/>
+        </w:rPr>
+        <w:t>خروج20 :24–26</w:t>
+      </w:r>
+    </w:p>
+    <w:p>
+      <w:pPr>
+        <w:pStyle w:val="ListBullet"/>
+        <w:bidi/>
+        <w:spacing w:line="240" w:lineRule="auto"/>
+        <w:ind w:left="720"/>
+      </w:pPr>
+      <w:r>
+        <w:rPr>
+          <w:rtl/>
+          <w:cs/>
+          <w:lang w:val="ar_AE" w:bidi="ar_AE"/>
+        </w:rPr>
+      </w:r>
+      <w:r>
+        <w:rPr>
+          <w:rtl/>
+          <w:cs/>
+          <w:lang w:val="ar_AE" w:bidi="ar_AE"/>
+        </w:rPr>
+        <w:t>تكوين34 :27</w:t>
+      </w:r>
+    </w:p>
+    <w:p>
+      <w:pPr>
+        <w:pStyle w:val="ListBullet"/>
+        <w:bidi/>
+        <w:spacing w:line="240" w:lineRule="auto"/>
+        <w:ind w:left="720"/>
+      </w:pPr>
+      <w:r>
+        <w:rPr>
+          <w:rtl/>
+          <w:cs/>
+          <w:lang w:val="ar_AE" w:bidi="ar_AE"/>
+        </w:rPr>
+      </w:r>
+      <w:r>
+        <w:rPr>
+          <w:rtl/>
+          <w:cs/>
+          <w:lang w:val="ar_AE" w:bidi="ar_AE"/>
+        </w:rPr>
+        <w:t>تكوين49 :4</w:t>
+      </w:r>
+    </w:p>
+    <w:p>
+      <w:pPr>
+        <w:pStyle w:val="ListBullet"/>
+        <w:bidi/>
+        <w:spacing w:line="240" w:lineRule="auto"/>
+        <w:ind w:left="720"/>
+      </w:pPr>
+      <w:r>
+        <w:rPr>
+          <w:rtl/>
+          <w:cs/>
+          <w:lang w:val="ar_AE" w:bidi="ar_AE"/>
+        </w:rPr>
+      </w:r>
+      <w:r>
+        <w:rPr>
+          <w:rtl/>
+          <w:cs/>
+          <w:lang w:val="ar_AE" w:bidi="ar_AE"/>
+        </w:rPr>
+        <w:t>إشعياء43 :27–28</w:t>
+      </w:r>
+    </w:p>
+    <w:p>
+      <w:pPr>
+        <w:pStyle w:val="ListBullet"/>
+        <w:bidi/>
+        <w:spacing w:line="240" w:lineRule="auto"/>
+        <w:ind w:left="720"/>
+      </w:pPr>
+      <w:r>
+        <w:rPr>
+          <w:rtl/>
+          <w:cs/>
+          <w:lang w:val="ar_AE" w:bidi="ar_AE"/>
+        </w:rPr>
+      </w:r>
+      <w:r>
+        <w:rPr>
+          <w:rtl/>
+          <w:cs/>
+          <w:lang w:val="ar_AE" w:bidi="ar_AE"/>
+        </w:rPr>
+        <w:t>اللاويين11 :43–45</w:t>
+      </w:r>
+    </w:p>
+    <w:p>
+      <w:pPr>
+        <w:pStyle w:val="ListBullet"/>
+        <w:bidi/>
+        <w:spacing w:line="240" w:lineRule="auto"/>
+        <w:ind w:left="720"/>
+      </w:pPr>
+      <w:r>
+        <w:rPr>
+          <w:rtl/>
+          <w:cs/>
+          <w:lang w:val="ar_AE" w:bidi="ar_AE"/>
+        </w:rPr>
+      </w:r>
+      <w:r>
+        <w:rPr>
+          <w:rtl/>
+          <w:cs/>
+          <w:lang w:val="ar_AE" w:bidi="ar_AE"/>
+        </w:rPr>
+        <w:t>مرقس7 :14–16</w:t>
+      </w:r>
+    </w:p>
+    <w:p>
+      <w:pPr>
+        <w:pStyle w:val="ListBullet"/>
+        <w:bidi/>
+        <w:spacing w:line="240" w:lineRule="auto"/>
+        <w:ind w:left="720"/>
+      </w:pPr>
+      <w:r>
+        <w:rPr>
+          <w:rtl/>
+          <w:cs/>
+          <w:lang w:val="ar_AE" w:bidi="ar_AE"/>
+        </w:rPr>
+      </w:r>
+      <w:r>
+        <w:rPr>
+          <w:rtl/>
+          <w:cs/>
+          <w:lang w:val="ar_AE" w:bidi="ar_AE"/>
+        </w:rPr>
+        <w:t>متى15 :10</w:t>
+      </w:r>
     </w:p>
     <w:p>
       <w:pPr>
@@ -6531,223 +6177,175 @@
           <w:lang w:val="ar_AE" w:bidi="ar_AE"/>
         </w:rPr>
       </w:r>
-      <w:hyperlink r:id="rId72">
-        <w:r>
-          <w:rPr>
-            <w:rtl/>
-            <w:cs/>
-            <w:lang w:val="ar_AE" w:bidi="ar_AE"/>
-          </w:rPr>
-          <w:rPr>
-            <w:color w:val="0000EE"/>
-            <w:u w:val="single"/>
-          </w:rPr>
-          <w:t>1 يوحنا 3: 20</w:t>
-        </w:r>
-      </w:hyperlink>
-    </w:p>
-    <w:p>
-      <w:pPr>
-        <w:pStyle w:val="ListBullet"/>
-        <w:bidi/>
-        <w:spacing w:line="240" w:lineRule="auto"/>
-        <w:ind w:left="720"/>
-      </w:pPr>
-      <w:r>
-        <w:rPr>
-          <w:rtl/>
-          <w:cs/>
-          <w:lang w:val="ar_AE" w:bidi="ar_AE"/>
-        </w:rPr>
-      </w:r>
-      <w:hyperlink r:id="rId73">
-        <w:r>
-          <w:rPr>
-            <w:rtl/>
-            <w:cs/>
-            <w:lang w:val="ar_AE" w:bidi="ar_AE"/>
-          </w:rPr>
-          <w:rPr>
-            <w:color w:val="0000EE"/>
-            <w:u w:val="single"/>
-          </w:rPr>
-          <w:t>أيوب 9: 29</w:t>
-        </w:r>
-      </w:hyperlink>
-    </w:p>
-    <w:p>
-      <w:pPr>
-        <w:pStyle w:val="ListBullet"/>
-        <w:bidi/>
-        <w:spacing w:line="240" w:lineRule="auto"/>
-        <w:ind w:left="720"/>
-      </w:pPr>
-      <w:r>
-        <w:rPr>
-          <w:rtl/>
-          <w:cs/>
-          <w:lang w:val="ar_AE" w:bidi="ar_AE"/>
-        </w:rPr>
-      </w:r>
-      <w:hyperlink r:id="rId74">
-        <w:r>
-          <w:rPr>
-            <w:rtl/>
-            <w:cs/>
-            <w:lang w:val="ar_AE" w:bidi="ar_AE"/>
-          </w:rPr>
-          <w:rPr>
-            <w:color w:val="0000EE"/>
-            <w:u w:val="single"/>
-          </w:rPr>
-          <w:t>يوحنا 5: 24</w:t>
-        </w:r>
-      </w:hyperlink>
-    </w:p>
-    <w:p>
-      <w:pPr>
-        <w:pStyle w:val="ListBullet"/>
-        <w:bidi/>
-        <w:spacing w:line="240" w:lineRule="auto"/>
-        <w:ind w:left="720"/>
-      </w:pPr>
-      <w:r>
-        <w:rPr>
-          <w:rtl/>
-          <w:cs/>
-          <w:lang w:val="ar_AE" w:bidi="ar_AE"/>
-        </w:rPr>
-      </w:r>
-      <w:hyperlink r:id="rId75">
-        <w:r>
-          <w:rPr>
-            <w:rtl/>
-            <w:cs/>
-            <w:lang w:val="ar_AE" w:bidi="ar_AE"/>
-          </w:rPr>
-          <w:rPr>
-            <w:color w:val="0000EE"/>
-            <w:u w:val="single"/>
-          </w:rPr>
-          <w:t>لوقا 6: 37</w:t>
-        </w:r>
-      </w:hyperlink>
-    </w:p>
-    <w:p>
-      <w:pPr>
-        <w:pStyle w:val="ListBullet"/>
-        <w:bidi/>
-        <w:spacing w:line="240" w:lineRule="auto"/>
-        <w:ind w:left="720"/>
-      </w:pPr>
-      <w:r>
-        <w:rPr>
-          <w:rtl/>
-          <w:cs/>
-          <w:lang w:val="ar_AE" w:bidi="ar_AE"/>
-        </w:rPr>
-      </w:r>
-      <w:hyperlink r:id="rId76">
-        <w:r>
-          <w:rPr>
-            <w:rtl/>
-            <w:cs/>
-            <w:lang w:val="ar_AE" w:bidi="ar_AE"/>
-          </w:rPr>
-          <w:rPr>
-            <w:color w:val="0000EE"/>
-            <w:u w:val="single"/>
-          </w:rPr>
-          <w:t>متى 12: 7</w:t>
-        </w:r>
-      </w:hyperlink>
-    </w:p>
-    <w:p>
-      <w:pPr>
-        <w:pStyle w:val="ListBullet"/>
-        <w:bidi/>
-        <w:spacing w:line="240" w:lineRule="auto"/>
-        <w:ind w:left="720"/>
-      </w:pPr>
-      <w:r>
-        <w:rPr>
-          <w:rtl/>
-          <w:cs/>
-          <w:lang w:val="ar_AE" w:bidi="ar_AE"/>
-        </w:rPr>
-      </w:r>
-      <w:hyperlink r:id="rId77">
-        <w:r>
-          <w:rPr>
-            <w:rtl/>
-            <w:cs/>
-            <w:lang w:val="ar_AE" w:bidi="ar_AE"/>
-          </w:rPr>
-          <w:rPr>
-            <w:color w:val="0000EE"/>
-            <w:u w:val="single"/>
-          </w:rPr>
-          <w:t>أمثال 17: 15–16</w:t>
-        </w:r>
-      </w:hyperlink>
-    </w:p>
-    <w:p>
-      <w:pPr>
-        <w:pStyle w:val="ListBullet"/>
-        <w:bidi/>
-        <w:spacing w:line="240" w:lineRule="auto"/>
-        <w:ind w:left="720"/>
-      </w:pPr>
-      <w:r>
-        <w:rPr>
-          <w:rtl/>
-          <w:cs/>
-          <w:lang w:val="ar_AE" w:bidi="ar_AE"/>
-        </w:rPr>
-      </w:r>
-      <w:hyperlink r:id="rId78">
-        <w:r>
-          <w:rPr>
-            <w:rtl/>
-            <w:cs/>
-            <w:lang w:val="ar_AE" w:bidi="ar_AE"/>
-          </w:rPr>
-          <w:rPr>
-            <w:color w:val="0000EE"/>
-            <w:u w:val="single"/>
-          </w:rPr>
-          <w:t>مزامير 34: 22</w:t>
-        </w:r>
-      </w:hyperlink>
-    </w:p>
-    <w:p>
-      <w:pPr>
-        <w:pStyle w:val="ListBullet"/>
-        <w:bidi/>
-        <w:spacing w:line="240" w:lineRule="auto"/>
-        <w:ind w:left="720"/>
-      </w:pPr>
-      <w:r>
-        <w:rPr>
-          <w:rtl/>
-          <w:cs/>
-          <w:lang w:val="ar_AE" w:bidi="ar_AE"/>
-        </w:rPr>
-      </w:r>
-      <w:hyperlink r:id="rId79">
-        <w:r>
-          <w:rPr>
-            <w:rtl/>
-            <w:cs/>
-            <w:lang w:val="ar_AE" w:bidi="ar_AE"/>
-          </w:rPr>
-          <w:rPr>
-            <w:color w:val="0000EE"/>
-            <w:u w:val="single"/>
-          </w:rPr>
-          <w:t>رومية 5: 16</w:t>
-        </w:r>
-      </w:hyperlink>
+      <w:r>
+        <w:rPr>
+          <w:rtl/>
+          <w:cs/>
+          <w:lang w:val="ar_AE" w:bidi="ar_AE"/>
+        </w:rPr>
+        <w:t>1 يوحنا 3: 20</w:t>
+      </w:r>
+    </w:p>
+    <w:p>
+      <w:pPr>
+        <w:pStyle w:val="ListBullet"/>
+        <w:bidi/>
+        <w:spacing w:line="240" w:lineRule="auto"/>
+        <w:ind w:left="720"/>
+      </w:pPr>
+      <w:r>
+        <w:rPr>
+          <w:rtl/>
+          <w:cs/>
+          <w:lang w:val="ar_AE" w:bidi="ar_AE"/>
+        </w:rPr>
+      </w:r>
+      <w:r>
+        <w:rPr>
+          <w:rtl/>
+          <w:cs/>
+          <w:lang w:val="ar_AE" w:bidi="ar_AE"/>
+        </w:rPr>
+        <w:t>أيوب 9: 29</w:t>
+      </w:r>
+    </w:p>
+    <w:p>
+      <w:pPr>
+        <w:pStyle w:val="ListBullet"/>
+        <w:bidi/>
+        <w:spacing w:line="240" w:lineRule="auto"/>
+        <w:ind w:left="720"/>
+      </w:pPr>
+      <w:r>
+        <w:rPr>
+          <w:rtl/>
+          <w:cs/>
+          <w:lang w:val="ar_AE" w:bidi="ar_AE"/>
+        </w:rPr>
+      </w:r>
+      <w:r>
+        <w:rPr>
+          <w:rtl/>
+          <w:cs/>
+          <w:lang w:val="ar_AE" w:bidi="ar_AE"/>
+        </w:rPr>
+        <w:t>يوحنا 5: 24</w:t>
+      </w:r>
+    </w:p>
+    <w:p>
+      <w:pPr>
+        <w:pStyle w:val="ListBullet"/>
+        <w:bidi/>
+        <w:spacing w:line="240" w:lineRule="auto"/>
+        <w:ind w:left="720"/>
+      </w:pPr>
+      <w:r>
+        <w:rPr>
+          <w:rtl/>
+          <w:cs/>
+          <w:lang w:val="ar_AE" w:bidi="ar_AE"/>
+        </w:rPr>
+      </w:r>
+      <w:r>
+        <w:rPr>
+          <w:rtl/>
+          <w:cs/>
+          <w:lang w:val="ar_AE" w:bidi="ar_AE"/>
+        </w:rPr>
+        <w:t>لوقا 6: 37</w:t>
+      </w:r>
+    </w:p>
+    <w:p>
+      <w:pPr>
+        <w:pStyle w:val="ListBullet"/>
+        <w:bidi/>
+        <w:spacing w:line="240" w:lineRule="auto"/>
+        <w:ind w:left="720"/>
+      </w:pPr>
+      <w:r>
+        <w:rPr>
+          <w:rtl/>
+          <w:cs/>
+          <w:lang w:val="ar_AE" w:bidi="ar_AE"/>
+        </w:rPr>
+      </w:r>
+      <w:r>
+        <w:rPr>
+          <w:rtl/>
+          <w:cs/>
+          <w:lang w:val="ar_AE" w:bidi="ar_AE"/>
+        </w:rPr>
+        <w:t>متى 12: 7</w:t>
+      </w:r>
+    </w:p>
+    <w:p>
+      <w:pPr>
+        <w:pStyle w:val="ListBullet"/>
+        <w:bidi/>
+        <w:spacing w:line="240" w:lineRule="auto"/>
+        <w:ind w:left="720"/>
+      </w:pPr>
+      <w:r>
+        <w:rPr>
+          <w:rtl/>
+          <w:cs/>
+          <w:lang w:val="ar_AE" w:bidi="ar_AE"/>
+        </w:rPr>
+      </w:r>
+      <w:r>
+        <w:rPr>
+          <w:rtl/>
+          <w:cs/>
+          <w:lang w:val="ar_AE" w:bidi="ar_AE"/>
+        </w:rPr>
+        <w:t>أمثال 17: 15–16</w:t>
+      </w:r>
+    </w:p>
+    <w:p>
+      <w:pPr>
+        <w:pStyle w:val="ListBullet"/>
+        <w:bidi/>
+        <w:spacing w:line="240" w:lineRule="auto"/>
+        <w:ind w:left="720"/>
+      </w:pPr>
+      <w:r>
+        <w:rPr>
+          <w:rtl/>
+          <w:cs/>
+          <w:lang w:val="ar_AE" w:bidi="ar_AE"/>
+        </w:rPr>
+      </w:r>
+      <w:r>
+        <w:rPr>
+          <w:rtl/>
+          <w:cs/>
+          <w:lang w:val="ar_AE" w:bidi="ar_AE"/>
+        </w:rPr>
+        <w:t>مزامير 34: 22</w:t>
+      </w:r>
+    </w:p>
+    <w:p>
+      <w:pPr>
+        <w:pStyle w:val="ListBullet"/>
+        <w:bidi/>
+        <w:spacing w:line="240" w:lineRule="auto"/>
+        <w:ind w:left="720"/>
+      </w:pPr>
+      <w:r>
+        <w:rPr>
+          <w:rtl/>
+          <w:cs/>
+          <w:lang w:val="ar_AE" w:bidi="ar_AE"/>
+        </w:rPr>
+      </w:r>
+      <w:r>
+        <w:rPr>
+          <w:rtl/>
+          <w:cs/>
+          <w:lang w:val="ar_AE" w:bidi="ar_AE"/>
+        </w:rPr>
+        <w:t>رومية 5: 16</w:t>
+      </w:r>
     </w:p>
     <w:p>
       <w:pPr>

</xml_diff>

<commit_message>
Refresh Bible resource data for 2026-10-12
</commit_message>
<xml_diff>
--- a/arb/docx/008.content.docx
+++ b/arb/docx/008.content.docx
@@ -3860,23 +3860,7 @@
           <w:cs/>
           <w:lang w:val="ar_AE" w:bidi="ar_AE"/>
         </w:rPr>
-        <w:t xml:space="preserve">, </w:t>
-      </w:r>
-      <w:r>
-        <w:rPr>
-          <w:rtl/>
-          <w:cs/>
-          <w:lang w:val="ar_AE" w:bidi="ar_AE"/>
-        </w:rPr>
-        <w:t>يخترق</w:t>
-      </w:r>
-      <w:r>
-        <w:rPr>
-          <w:rtl/>
-          <w:cs/>
-          <w:lang w:val="ar_AE" w:bidi="ar_AE"/>
-        </w:rPr>
-        <w:t xml:space="preserve">, </w:t>
+        <w:t xml:space="preserve">, يخترق, </w:t>
       </w:r>
       <w:r>
         <w:rPr>

</xml_diff>